<commit_message>
Completa laboratorio 08 de procesamiento de imagenes
</commit_message>
<xml_diff>
--- a/Laboratorio_0x_Pacori_Anccasi_Diego_UNSA_ CGVCM.docx
+++ b/Laboratorio_0x_Pacori_Anccasi_Diego_UNSA_ CGVCM.docx
@@ -15,21 +15,19 @@
       </w:pPr>
       <w:r>
         <w:rPr>
-          <w:b w:val="1"/>
-          <w:bCs w:val="1"/>
-          <w:color w:val="000000"/>
-          <w:sz w:val="32"/>
-          <w:szCs w:val="32"/>
-          <w:rtl w:val="0"/>
-        </w:rPr>
-        <w:t xml:space="preserve">INFORME DE LABORATORIO</w:t>
+          <w:rFonts w:ascii="Calibri" w:hAnsi="Calibri"/>
+          <w:b/>
+          <w:color w:val="1F4D78"/>
+          <w:sz w:val="36"/>
+        </w:rPr>
+        <w:t>INFORME DE LABORATORIO 08</w:t>
       </w:r>
     </w:p>
     <w:tbl>
       <w:tblPr>
         <w:tblStyle w:val="Table1"/>
         <w:tblW w:w="10266.000000000002" w:type="dxa"/>
-        <w:jc w:val="left"/>
+        <w:jc w:val="center"/>
         <w:tblInd w:w="-397.0" w:type="dxa"/>
         <w:tblBorders>
           <w:top w:color="000000" w:space="0" w:sz="4" w:val="single"/>
@@ -71,6 +69,12 @@
             <w:gridSpan w:val="6"/>
             <w:shd w:fill="c8310e" w:val="clear"/>
             <w:vAlign w:val="center"/>
+            <w:tcMar>
+              <w:top w:w="80" w:type="dxa"/>
+              <w:start w:w="120" w:type="dxa"/>
+              <w:bottom w:w="80" w:type="dxa"/>
+              <w:end w:w="120" w:type="dxa"/>
+            </w:tcMar>
           </w:tcPr>
           <w:p>
             <w:pPr>
@@ -82,10 +86,11 @@
             </w:pPr>
             <w:r>
               <w:rPr>
+                <w:rFonts w:ascii="Calibri" w:hAnsi="Calibri"/>
                 <w:b w:val="1"/>
                 <w:bCs w:val="1"/>
                 <w:color w:val="ffffff"/>
-                <w:sz w:val="24"/>
+                <w:sz w:val="20"/>
                 <w:szCs w:val="24"/>
                 <w:rtl w:val="0"/>
               </w:rPr>
@@ -109,6 +114,12 @@
           <w:tcPr>
             <w:shd w:fill="auto" w:val="clear"/>
             <w:vAlign w:val="center"/>
+            <w:tcMar>
+              <w:top w:w="80" w:type="dxa"/>
+              <w:start w:w="120" w:type="dxa"/>
+              <w:bottom w:w="80" w:type="dxa"/>
+              <w:end w:w="120" w:type="dxa"/>
+            </w:tcMar>
           </w:tcPr>
           <w:p>
             <w:pPr>
@@ -124,9 +135,10 @@
             </w:pPr>
             <w:r>
               <w:rPr>
+                <w:rFonts w:ascii="Calibri" w:hAnsi="Calibri"/>
                 <w:b w:val="1"/>
                 <w:bCs w:val="1"/>
-                <w:sz w:val="24"/>
+                <w:sz w:val="20"/>
                 <w:szCs w:val="24"/>
                 <w:rtl w:val="0"/>
               </w:rPr>
@@ -139,6 +151,12 @@
             <w:gridSpan w:val="5"/>
             <w:shd w:fill="auto" w:val="clear"/>
             <w:vAlign w:val="center"/>
+            <w:tcMar>
+              <w:top w:w="80" w:type="dxa"/>
+              <w:start w:w="120" w:type="dxa"/>
+              <w:bottom w:w="80" w:type="dxa"/>
+              <w:end w:w="120" w:type="dxa"/>
+            </w:tcMar>
           </w:tcPr>
           <w:p>
             <w:pPr>
@@ -151,9 +169,10 @@
             </w:pPr>
             <w:r>
               <w:rPr>
+                <w:rFonts w:ascii="Calibri" w:hAnsi="Calibri"/>
                 <w:b w:val="1"/>
                 <w:bCs w:val="1"/>
-                <w:sz w:val="24"/>
+                <w:sz w:val="20"/>
                 <w:szCs w:val="24"/>
                 <w:rtl w:val="0"/>
               </w:rPr>
@@ -172,6 +191,12 @@
           <w:tcPr>
             <w:shd w:fill="auto" w:val="clear"/>
             <w:vAlign w:val="center"/>
+            <w:tcMar>
+              <w:top w:w="80" w:type="dxa"/>
+              <w:start w:w="120" w:type="dxa"/>
+              <w:bottom w:w="80" w:type="dxa"/>
+              <w:end w:w="120" w:type="dxa"/>
+            </w:tcMar>
           </w:tcPr>
           <w:p>
             <w:pPr>
@@ -184,9 +209,10 @@
             </w:pPr>
             <w:r>
               <w:rPr>
+                <w:rFonts w:ascii="Calibri" w:hAnsi="Calibri"/>
                 <w:b w:val="1"/>
                 <w:bCs w:val="1"/>
-                <w:sz w:val="24"/>
+                <w:sz w:val="20"/>
                 <w:szCs w:val="24"/>
                 <w:rtl w:val="0"/>
               </w:rPr>
@@ -199,6 +225,12 @@
             <w:gridSpan w:val="5"/>
             <w:shd w:fill="auto" w:val="clear"/>
             <w:vAlign w:val="center"/>
+            <w:tcMar>
+              <w:top w:w="80" w:type="dxa"/>
+              <w:start w:w="120" w:type="dxa"/>
+              <w:bottom w:w="80" w:type="dxa"/>
+              <w:end w:w="120" w:type="dxa"/>
+            </w:tcMar>
           </w:tcPr>
           <w:p>
             <w:pPr>
@@ -210,12 +242,14 @@
             </w:pPr>
             <w:r>
               <w:rPr>
+                <w:rFonts w:ascii="Calibri" w:hAnsi="Calibri"/>
                 <w:i w:val="1"/>
                 <w:iCs w:val="1"/>
                 <w:color w:val="2f5496"/>
+                <w:sz w:val="20"/>
                 <w:rtl w:val="0"/>
               </w:rPr>
-              <w:t xml:space="preserve">Laboratorio 0x</w:t>
+              <w:t>Laboratorio 08 - Procesamiento de Imagenes</w:t>
             </w:r>
           </w:p>
         </w:tc>
@@ -230,6 +264,12 @@
           <w:tcPr>
             <w:shd w:fill="auto" w:val="clear"/>
             <w:vAlign w:val="center"/>
+            <w:tcMar>
+              <w:top w:w="80" w:type="dxa"/>
+              <w:start w:w="120" w:type="dxa"/>
+              <w:bottom w:w="80" w:type="dxa"/>
+              <w:end w:w="120" w:type="dxa"/>
+            </w:tcMar>
           </w:tcPr>
           <w:p>
             <w:pPr>
@@ -240,9 +280,10 @@
             </w:pPr>
             <w:r>
               <w:rPr>
+                <w:rFonts w:ascii="Calibri" w:hAnsi="Calibri"/>
                 <w:b w:val="1"/>
                 <w:bCs w:val="1"/>
-                <w:sz w:val="24"/>
+                <w:sz w:val="20"/>
                 <w:szCs w:val="24"/>
                 <w:rtl w:val="0"/>
               </w:rPr>
@@ -259,23 +300,20 @@
           <w:tcPr>
             <w:shd w:fill="auto" w:val="clear"/>
             <w:vAlign w:val="center"/>
+            <w:tcMar>
+              <w:top w:w="80" w:type="dxa"/>
+              <w:start w:w="120" w:type="dxa"/>
+              <w:bottom w:w="80" w:type="dxa"/>
+              <w:end w:w="120" w:type="dxa"/>
+            </w:tcMar>
           </w:tcPr>
           <w:p>
-            <w:pPr>
-              <w:rPr>
-                <w:i w:val="1"/>
-                <w:iCs w:val="1"/>
-                <w:color w:val="2f5496"/>
-              </w:rPr>
-            </w:pPr>
-            <w:r>
-              <w:rPr>
-                <w:i w:val="1"/>
-                <w:iCs w:val="1"/>
-                <w:color w:val="2f5496"/>
-                <w:rtl w:val="0"/>
-              </w:rPr>
-              <w:t xml:space="preserve">01</w:t>
+            <w:r>
+              <w:rPr>
+                <w:rFonts w:ascii="Calibri" w:hAnsi="Calibri"/>
+                <w:sz w:val="20"/>
+              </w:rPr>
+              <w:t>08</w:t>
             </w:r>
           </w:p>
         </w:tc>
@@ -283,6 +321,12 @@
           <w:tcPr>
             <w:shd w:fill="auto" w:val="clear"/>
             <w:vAlign w:val="center"/>
+            <w:tcMar>
+              <w:top w:w="80" w:type="dxa"/>
+              <w:start w:w="120" w:type="dxa"/>
+              <w:bottom w:w="80" w:type="dxa"/>
+              <w:end w:w="120" w:type="dxa"/>
+            </w:tcMar>
           </w:tcPr>
           <w:p>
             <w:pPr>
@@ -294,9 +338,10 @@
             </w:pPr>
             <w:r>
               <w:rPr>
+                <w:rFonts w:ascii="Calibri" w:hAnsi="Calibri"/>
                 <w:b w:val="1"/>
                 <w:bCs w:val="1"/>
-                <w:sz w:val="24"/>
+                <w:sz w:val="20"/>
                 <w:szCs w:val="24"/>
                 <w:rtl w:val="0"/>
               </w:rPr>
@@ -313,6 +358,12 @@
           <w:tcPr>
             <w:shd w:fill="auto" w:val="clear"/>
             <w:vAlign w:val="center"/>
+            <w:tcMar>
+              <w:top w:w="80" w:type="dxa"/>
+              <w:start w:w="120" w:type="dxa"/>
+              <w:bottom w:w="80" w:type="dxa"/>
+              <w:end w:w="120" w:type="dxa"/>
+            </w:tcMar>
           </w:tcPr>
           <w:p>
             <w:pPr>
@@ -324,12 +375,14 @@
             </w:pPr>
             <w:r>
               <w:rPr>
+                <w:rFonts w:ascii="Calibri" w:hAnsi="Calibri"/>
                 <w:i w:val="1"/>
                 <w:iCs w:val="1"/>
                 <w:color w:val="2f5496"/>
+                <w:sz w:val="20"/>
                 <w:rtl w:val="0"/>
               </w:rPr>
-              <w:t xml:space="preserve">2026-A</w:t>
+              <w:t>2026-B</w:t>
             </w:r>
           </w:p>
         </w:tc>
@@ -337,6 +390,12 @@
           <w:tcPr>
             <w:shd w:fill="auto" w:val="clear"/>
             <w:vAlign w:val="center"/>
+            <w:tcMar>
+              <w:top w:w="80" w:type="dxa"/>
+              <w:start w:w="120" w:type="dxa"/>
+              <w:bottom w:w="80" w:type="dxa"/>
+              <w:end w:w="120" w:type="dxa"/>
+            </w:tcMar>
           </w:tcPr>
           <w:p>
             <w:pPr>
@@ -348,9 +407,10 @@
             </w:pPr>
             <w:r>
               <w:rPr>
+                <w:rFonts w:ascii="Calibri" w:hAnsi="Calibri"/>
                 <w:b w:val="1"/>
                 <w:bCs w:val="1"/>
-                <w:sz w:val="24"/>
+                <w:sz w:val="20"/>
                 <w:szCs w:val="24"/>
                 <w:rtl w:val="0"/>
               </w:rPr>
@@ -367,6 +427,12 @@
           <w:tcPr>
             <w:shd w:fill="auto" w:val="clear"/>
             <w:vAlign w:val="center"/>
+            <w:tcMar>
+              <w:top w:w="80" w:type="dxa"/>
+              <w:start w:w="120" w:type="dxa"/>
+              <w:bottom w:w="80" w:type="dxa"/>
+              <w:end w:w="120" w:type="dxa"/>
+            </w:tcMar>
           </w:tcPr>
           <w:p>
             <w:pPr>
@@ -378,9 +444,11 @@
             </w:pPr>
             <w:r>
               <w:rPr>
+                <w:rFonts w:ascii="Calibri" w:hAnsi="Calibri"/>
                 <w:i w:val="1"/>
                 <w:iCs w:val="1"/>
                 <w:color w:val="2f5496"/>
+                <w:sz w:val="20"/>
                 <w:rtl w:val="0"/>
               </w:rPr>
               <w:t xml:space="preserve">IX (noveno)</w:t>
@@ -398,6 +466,12 @@
           <w:tcPr>
             <w:shd w:fill="auto" w:val="clear"/>
             <w:vAlign w:val="center"/>
+            <w:tcMar>
+              <w:top w:w="80" w:type="dxa"/>
+              <w:start w:w="120" w:type="dxa"/>
+              <w:bottom w:w="80" w:type="dxa"/>
+              <w:end w:w="120" w:type="dxa"/>
+            </w:tcMar>
           </w:tcPr>
           <w:p>
             <w:pPr>
@@ -410,9 +484,10 @@
             </w:pPr>
             <w:r>
               <w:rPr>
+                <w:rFonts w:ascii="Calibri" w:hAnsi="Calibri"/>
                 <w:b w:val="1"/>
                 <w:bCs w:val="1"/>
-                <w:sz w:val="24"/>
+                <w:sz w:val="20"/>
                 <w:szCs w:val="24"/>
                 <w:rtl w:val="0"/>
               </w:rPr>
@@ -424,6 +499,12 @@
           <w:tcPr>
             <w:shd w:fill="auto" w:val="clear"/>
             <w:vAlign w:val="center"/>
+            <w:tcMar>
+              <w:top w:w="80" w:type="dxa"/>
+              <w:start w:w="120" w:type="dxa"/>
+              <w:bottom w:w="80" w:type="dxa"/>
+              <w:end w:w="120" w:type="dxa"/>
+            </w:tcMar>
           </w:tcPr>
           <w:p>
             <w:pPr>
@@ -435,12 +516,14 @@
             </w:pPr>
             <w:r>
               <w:rPr>
+                <w:rFonts w:ascii="Calibri" w:hAnsi="Calibri"/>
                 <w:i w:val="1"/>
                 <w:iCs w:val="1"/>
                 <w:color w:val="ff0000"/>
+                <w:sz w:val="20"/>
                 <w:rtl w:val="0"/>
               </w:rPr>
-              <w:t xml:space="preserve">05/03/2026</w:t>
+              <w:t>06/07/2026</w:t>
             </w:r>
             <w:r>
               <w:rPr>
@@ -453,6 +536,12 @@
           <w:tcPr>
             <w:shd w:fill="auto" w:val="clear"/>
             <w:vAlign w:val="center"/>
+            <w:tcMar>
+              <w:top w:w="80" w:type="dxa"/>
+              <w:start w:w="120" w:type="dxa"/>
+              <w:bottom w:w="80" w:type="dxa"/>
+              <w:end w:w="120" w:type="dxa"/>
+            </w:tcMar>
           </w:tcPr>
           <w:p>
             <w:pPr>
@@ -465,9 +554,10 @@
             </w:pPr>
             <w:r>
               <w:rPr>
+                <w:rFonts w:ascii="Calibri" w:hAnsi="Calibri"/>
                 <w:b w:val="1"/>
                 <w:bCs w:val="1"/>
-                <w:sz w:val="24"/>
+                <w:sz w:val="20"/>
                 <w:szCs w:val="24"/>
                 <w:rtl w:val="0"/>
               </w:rPr>
@@ -480,6 +570,12 @@
             <w:gridSpan w:val="3"/>
             <w:shd w:fill="auto" w:val="clear"/>
             <w:vAlign w:val="center"/>
+            <w:tcMar>
+              <w:top w:w="80" w:type="dxa"/>
+              <w:start w:w="120" w:type="dxa"/>
+              <w:bottom w:w="80" w:type="dxa"/>
+              <w:end w:w="120" w:type="dxa"/>
+            </w:tcMar>
           </w:tcPr>
           <w:p>
             <w:pPr>
@@ -491,9 +587,11 @@
             </w:pPr>
             <w:r>
               <w:rPr>
+                <w:rFonts w:ascii="Calibri" w:hAnsi="Calibri"/>
                 <w:i w:val="1"/>
                 <w:iCs w:val="1"/>
                 <w:color w:val="2f5496"/>
+                <w:sz w:val="20"/>
                 <w:rtl w:val="0"/>
               </w:rPr>
               <w:t xml:space="preserve">16:00</w:t>
@@ -512,6 +610,12 @@
             <w:gridSpan w:val="4"/>
             <w:shd w:fill="auto" w:val="clear"/>
             <w:vAlign w:val="center"/>
+            <w:tcMar>
+              <w:top w:w="80" w:type="dxa"/>
+              <w:start w:w="120" w:type="dxa"/>
+              <w:bottom w:w="80" w:type="dxa"/>
+              <w:end w:w="120" w:type="dxa"/>
+            </w:tcMar>
           </w:tcPr>
           <w:p>
             <w:pPr>
@@ -524,9 +628,10 @@
             </w:pPr>
             <w:r>
               <w:rPr>
+                <w:rFonts w:ascii="Calibri" w:hAnsi="Calibri"/>
                 <w:b w:val="1"/>
                 <w:bCs w:val="1"/>
-                <w:sz w:val="24"/>
+                <w:sz w:val="20"/>
                 <w:szCs w:val="24"/>
                 <w:rtl w:val="0"/>
               </w:rPr>
@@ -542,7 +647,8 @@
             </w:pPr>
             <w:r>
               <w:rPr>
-                <w:sz w:val="24"/>
+                <w:rFonts w:ascii="Calibri" w:hAnsi="Calibri"/>
+                <w:sz w:val="20"/>
                 <w:szCs w:val="24"/>
                 <w:rtl w:val="0"/>
               </w:rPr>
@@ -567,6 +673,12 @@
           <w:tcPr>
             <w:shd w:fill="auto" w:val="clear"/>
             <w:vAlign w:val="center"/>
+            <w:tcMar>
+              <w:top w:w="80" w:type="dxa"/>
+              <w:start w:w="120" w:type="dxa"/>
+              <w:bottom w:w="80" w:type="dxa"/>
+              <w:end w:w="120" w:type="dxa"/>
+            </w:tcMar>
           </w:tcPr>
           <w:p>
             <w:pPr>
@@ -578,9 +690,10 @@
             </w:pPr>
             <w:r>
               <w:rPr>
+                <w:rFonts w:ascii="Calibri" w:hAnsi="Calibri"/>
                 <w:b w:val="1"/>
                 <w:bCs w:val="1"/>
-                <w:sz w:val="24"/>
+                <w:sz w:val="20"/>
                 <w:szCs w:val="24"/>
                 <w:rtl w:val="0"/>
               </w:rPr>
@@ -597,6 +710,12 @@
           <w:tcPr>
             <w:shd w:fill="auto" w:val="clear"/>
             <w:vAlign w:val="center"/>
+            <w:tcMar>
+              <w:top w:w="80" w:type="dxa"/>
+              <w:start w:w="120" w:type="dxa"/>
+              <w:bottom w:w="80" w:type="dxa"/>
+              <w:end w:w="120" w:type="dxa"/>
+            </w:tcMar>
           </w:tcPr>
           <w:p>
             <w:pPr>
@@ -625,6 +744,12 @@
             <w:gridSpan w:val="6"/>
             <w:shd w:fill="auto" w:val="clear"/>
             <w:vAlign w:val="center"/>
+            <w:tcMar>
+              <w:top w:w="80" w:type="dxa"/>
+              <w:start w:w="120" w:type="dxa"/>
+              <w:bottom w:w="80" w:type="dxa"/>
+              <w:end w:w="120" w:type="dxa"/>
+            </w:tcMar>
           </w:tcPr>
           <w:p>
             <w:pPr>
@@ -636,9 +761,10 @@
             </w:pPr>
             <w:r>
               <w:rPr>
+                <w:rFonts w:ascii="Calibri" w:hAnsi="Calibri"/>
                 <w:b w:val="1"/>
                 <w:bCs w:val="1"/>
-                <w:sz w:val="24"/>
+                <w:sz w:val="20"/>
                 <w:szCs w:val="24"/>
                 <w:rtl w:val="0"/>
               </w:rPr>
@@ -646,9 +772,11 @@
             </w:r>
             <w:r>
               <w:rPr>
+                <w:rFonts w:ascii="Calibri" w:hAnsi="Calibri"/>
                 <w:i w:val="1"/>
                 <w:iCs w:val="1"/>
                 <w:color w:val="2f5496"/>
+                <w:sz w:val="20"/>
                 <w:rtl w:val="0"/>
               </w:rPr>
               <w:t xml:space="preserve">Mg. Diego Alonso Iquira Becerra</w:t>
@@ -673,370 +801,243 @@
     </w:tbl>
     <w:p>
       <w:pPr>
-        <w:rPr/>
-      </w:pPr>
-      <w:r>
-        <w:rPr>
-          <w:rtl w:val="0"/>
-        </w:rPr>
+        <w:pStyle w:val="Heading1"/>
+        <w:spacing w:before="360" w:after="200" w:line="300" w:lineRule="auto"/>
+      </w:pPr>
+      <w:r>
+        <w:rPr>
+          <w:rFonts w:ascii="Calibri" w:hAnsi="Calibri"/>
+          <w:b/>
+          <w:color w:val="2E74B5"/>
+          <w:sz w:val="32"/>
+        </w:rPr>
+        <w:t>Indice</w:t>
+      </w:r>
+    </w:p>
+    <w:p>
+      <w:pPr>
+        <w:numPr>
+          <w:ilvl w:val="0"/>
+          <w:numId w:val="4"/>
+        </w:numPr>
+        <w:spacing w:before="0" w:after="80" w:line="300" w:lineRule="auto"/>
+      </w:pPr>
+      <w:r>
+        <w:rPr>
+          <w:rFonts w:ascii="Calibri" w:hAnsi="Calibri"/>
+        </w:rPr>
+        <w:t>Entorno y revision del laboratorio</w:t>
+      </w:r>
+    </w:p>
+    <w:p>
+      <w:pPr>
+        <w:numPr>
+          <w:ilvl w:val="0"/>
+          <w:numId w:val="4"/>
+        </w:numPr>
+        <w:spacing w:before="0" w:after="80" w:line="300" w:lineRule="auto"/>
+      </w:pPr>
+      <w:r>
+        <w:rPr>
+          <w:rFonts w:ascii="Calibri" w:hAnsi="Calibri"/>
+        </w:rPr>
+        <w:t>Solucion de ejercicios propuestos</w:t>
+      </w:r>
+    </w:p>
+    <w:p>
+      <w:pPr>
+        <w:numPr>
+          <w:ilvl w:val="0"/>
+          <w:numId w:val="4"/>
+        </w:numPr>
+        <w:spacing w:before="0" w:after="80" w:line="300" w:lineRule="auto"/>
+      </w:pPr>
+      <w:r>
+        <w:rPr>
+          <w:rFonts w:ascii="Calibri" w:hAnsi="Calibri"/>
+        </w:rPr>
+        <w:t>Avances individuales del proyecto grupal</w:t>
+      </w:r>
+    </w:p>
+    <w:p>
+      <w:pPr>
+        <w:numPr>
+          <w:ilvl w:val="0"/>
+          <w:numId w:val="4"/>
+        </w:numPr>
+        <w:spacing w:before="0" w:after="80" w:line="300" w:lineRule="auto"/>
+      </w:pPr>
+      <w:r>
+        <w:rPr>
+          <w:rFonts w:ascii="Calibri" w:hAnsi="Calibri"/>
+        </w:rPr>
+        <w:t>Cuestionario</w:t>
+      </w:r>
+    </w:p>
+    <w:p>
+      <w:pPr>
+        <w:numPr>
+          <w:ilvl w:val="0"/>
+          <w:numId w:val="4"/>
+        </w:numPr>
+        <w:spacing w:before="0" w:after="80" w:line="300" w:lineRule="auto"/>
+      </w:pPr>
+      <w:r>
+        <w:rPr>
+          <w:rFonts w:ascii="Calibri" w:hAnsi="Calibri"/>
+        </w:rPr>
+        <w:t>Conclusiones</w:t>
+      </w:r>
+    </w:p>
+    <w:p>
+      <w:pPr>
+        <w:numPr>
+          <w:ilvl w:val="0"/>
+          <w:numId w:val="4"/>
+        </w:numPr>
+        <w:spacing w:before="0" w:after="80" w:line="300" w:lineRule="auto"/>
+      </w:pPr>
+      <w:r>
+        <w:rPr>
+          <w:rFonts w:ascii="Calibri" w:hAnsi="Calibri"/>
+        </w:rPr>
+        <w:t>Referencias y bibliografia</w:t>
+      </w:r>
+    </w:p>
+    <w:p>
+      <w:pPr>
+        <w:spacing w:before="0" w:after="120" w:line="300" w:lineRule="auto"/>
+      </w:pPr>
+      <w:r>
+        <w:rPr>
+          <w:rFonts w:ascii="Calibri" w:hAnsi="Calibri"/>
+        </w:rPr>
+        <w:t xml:space="preserve">Notebook/script principal: </w:t>
+      </w:r>
+      <w:hyperlink r:id="rId8">
+        <w:r>
+          <w:rPr>
+            <w:color w:val="0563C1"/>
+            <w:u w:val="single"/>
+          </w:rPr>
+          <w:t>notebooks/Laboratorio_08_Procesamiento_Imagenes.ipynb</w:t>
+        </w:r>
+      </w:hyperlink>
+    </w:p>
+    <w:p>
+      <w:pPr>
+        <w:pStyle w:val="Heading1"/>
+        <w:spacing w:before="360" w:after="200" w:line="300" w:lineRule="auto"/>
+      </w:pPr>
+      <w:r>
+        <w:rPr>
+          <w:rFonts w:ascii="Calibri" w:hAnsi="Calibri"/>
+          <w:b/>
+          <w:color w:val="2E74B5"/>
+          <w:sz w:val="32"/>
+        </w:rPr>
+        <w:t>Entorno y revision del laboratorio</w:t>
+      </w:r>
+    </w:p>
+    <w:p>
+      <w:pPr>
+        <w:spacing w:before="0" w:after="120" w:line="300" w:lineRule="auto"/>
+      </w:pPr>
+      <w:r>
+        <w:rPr>
+          <w:rFonts w:ascii="Calibri" w:hAnsi="Calibri"/>
+        </w:rPr>
+        <w:t>Se reviso la guia PDF del laboratorio 8, la cual solicita operaciones de procesamiento de imagenes: redimensionamiento sin deformacion, combinacion de canales, negativo, escala de grises, visualizacion interactiva de canales, dibujo sobre imagenes, threshold binario y una aplicacion de dibujo con eventos de mouse y teclado.</w:t>
+      </w:r>
+    </w:p>
+    <w:p>
+      <w:pPr>
+        <w:spacing w:before="0" w:after="120" w:line="300" w:lineRule="auto"/>
+      </w:pPr>
+      <w:r>
+        <w:rPr>
+          <w:rFonts w:ascii="Calibri" w:hAnsi="Calibri"/>
+        </w:rPr>
+        <w:t>No se encontraron notebooks ni imagenes base en la carpeta inicial; por ello se creo un notebook Jupyter autocontenido y tres imagenes a color reproducibles para resolver los ejercicios.</w:t>
+      </w:r>
+    </w:p>
+    <w:p>
+      <w:pPr>
+        <w:spacing w:before="0" w:after="120" w:line="300" w:lineRule="auto"/>
+      </w:pPr>
+      <w:r>
+        <w:rPr>
+          <w:rFonts w:ascii="Calibri" w:hAnsi="Calibri"/>
+        </w:rPr>
+        <w:t>Conda no estaba en el PATH de PowerShell, pero se encontro Anaconda en `C:\Users\diego\anaconda3`. Se creo el entorno `lab08-cgvc` y se registro el kernel `Python (lab08-cgvc)`.</w:t>
+      </w:r>
+    </w:p>
+    <w:p>
+      <w:pPr>
+        <w:spacing w:before="0" w:after="120" w:line="300" w:lineRule="auto"/>
+      </w:pPr>
+      <w:r>
+        <w:rPr>
+          <w:rFonts w:ascii="Calibri" w:hAnsi="Calibri"/>
+        </w:rPr>
+        <w:t>Versiones verificadas: Python 3.11.15, OpenCV 4.13.0, NumPy 2.4.6, Matplotlib 3.11.0, Pillow 12.2.0 y nbconvert 7.17.1.</w:t>
       </w:r>
     </w:p>
     <w:tbl>
       <w:tblPr>
-        <w:tblStyle w:val="Table2"/>
-        <w:tblW w:w="10266.0" w:type="dxa"/>
-        <w:jc w:val="left"/>
-        <w:tblInd w:w="-397.0" w:type="dxa"/>
-        <w:tblBorders>
-          <w:top w:color="000000" w:space="0" w:sz="4" w:val="single"/>
-          <w:left w:color="000000" w:space="0" w:sz="4" w:val="single"/>
-          <w:bottom w:color="000000" w:space="0" w:sz="4" w:val="single"/>
-          <w:right w:color="000000" w:space="0" w:sz="4" w:val="single"/>
-          <w:insideH w:color="000000" w:space="0" w:sz="4" w:val="single"/>
-          <w:insideV w:color="000000" w:space="0" w:sz="4" w:val="single"/>
-        </w:tblBorders>
-        <w:tblLayout w:type="fixed"/>
-        <w:tblLook w:val="0400"/>
+        <w:tblW w:type="auto" w:w="0"/>
+        <w:jc w:val="center"/>
+        <w:tblLook w:firstColumn="1" w:firstRow="1" w:lastColumn="0" w:lastRow="0" w:noHBand="0" w:noVBand="1" w:val="04A0"/>
       </w:tblPr>
       <w:tblGrid>
-        <w:gridCol w:w="10266"/>
-        <w:tblGridChange w:id="0">
-          <w:tblGrid>
-            <w:gridCol w:w="10266"/>
-          </w:tblGrid>
-        </w:tblGridChange>
+        <w:gridCol w:w="9026"/>
       </w:tblGrid>
       <w:tr>
-        <w:trPr>
-          <w:cantSplit w:val="0"/>
-          <w:trHeight w:val="397" w:hRule="atLeast"/>
-          <w:tblHeader w:val="0"/>
-        </w:trPr>
         <w:tc>
           <w:tcPr>
-            <w:shd w:fill="c8310e" w:val="clear"/>
+            <w:tcW w:type="dxa" w:w="9026"/>
+            <w:shd w:fill="F2F4F7"/>
+            <w:tcMar>
+              <w:top w:w="80" w:type="dxa"/>
+              <w:start w:w="120" w:type="dxa"/>
+              <w:bottom w:w="80" w:type="dxa"/>
+              <w:end w:w="120" w:type="dxa"/>
+            </w:tcMar>
             <w:vAlign w:val="center"/>
           </w:tcPr>
           <w:p>
             <w:pPr>
-              <w:jc w:val="center"/>
-              <w:rPr>
-                <w:b w:val="1"/>
-                <w:bCs w:val="1"/>
-                <w:color w:val="ffffff"/>
-                <w:sz w:val="24"/>
-                <w:szCs w:val="24"/>
-              </w:rPr>
+              <w:spacing w:before="0" w:after="0"/>
             </w:pPr>
             <w:r>
               <w:rPr>
-                <w:b w:val="1"/>
-                <w:bCs w:val="1"/>
-                <w:color w:val="ffffff"/>
-                <w:sz w:val="24"/>
-                <w:szCs w:val="24"/>
-                <w:rtl w:val="0"/>
-              </w:rPr>
-              <w:t xml:space="preserve">SOLUCIÓN Y RESULTADOS</w:t>
-            </w:r>
-          </w:p>
-        </w:tc>
-      </w:tr>
-      <w:tr>
-        <w:trPr>
-          <w:cantSplit w:val="0"/>
-          <w:trHeight w:val="838" w:hRule="atLeast"/>
-          <w:tblHeader w:val="0"/>
-        </w:trPr>
-        <w:tc>
-          <w:tcPr>
-            <w:shd w:fill="auto" w:val="clear"/>
-          </w:tcPr>
-          <w:p>
-            <w:pPr>
-              <w:keepNext w:val="0"/>
-              <w:keepLines w:val="0"/>
-              <w:widowControl w:val="1"/>
-              <w:numPr>
-                <w:ilvl w:val="0"/>
-                <w:numId w:val="3"/>
-              </w:numPr>
-              <w:pBdr>
-                <w:top w:space="0" w:sz="0" w:val="nil"/>
-                <w:left w:space="0" w:sz="0" w:val="nil"/>
-                <w:bottom w:space="0" w:sz="0" w:val="nil"/>
-                <w:right w:space="0" w:sz="0" w:val="nil"/>
-                <w:between w:space="0" w:sz="0" w:val="nil"/>
-              </w:pBdr>
-              <w:shd w:fill="auto" w:val="clear"/>
-              <w:spacing w:after="160" w:before="0" w:line="259" w:lineRule="auto"/>
-              <w:ind w:left="322" w:right="0" w:hanging="142"/>
-              <w:jc w:val="left"/>
-              <w:rPr>
-                <w:rFonts w:ascii="Calibri" w:cs="Calibri" w:eastAsia="Calibri" w:hAnsi="Calibri"/>
-                <w:b w:val="1"/>
-                <w:bCs w:val="1"/>
-                <w:i w:val="0"/>
-                <w:iCs w:val="0"/>
-                <w:smallCaps w:val="0"/>
-                <w:strike w:val="0"/>
-                <w:color w:val="000000"/>
-                <w:sz w:val="24"/>
-                <w:szCs w:val="24"/>
-                <w:u w:val="none"/>
-                <w:shd w:fill="auto" w:val="clear"/>
-                <w:vertAlign w:val="baseline"/>
-              </w:rPr>
-            </w:pPr>
-            <w:r>
-              <w:rPr>
-                <w:rFonts w:ascii="Calibri" w:cs="Calibri" w:eastAsia="Calibri" w:hAnsi="Calibri"/>
-                <w:b w:val="1"/>
-                <w:bCs w:val="1"/>
-                <w:i w:val="0"/>
-                <w:iCs w:val="0"/>
-                <w:smallCaps w:val="0"/>
-                <w:strike w:val="0"/>
-                <w:color w:val="000000"/>
-                <w:sz w:val="24"/>
-                <w:szCs w:val="24"/>
-                <w:u w:val="none"/>
-                <w:shd w:fill="auto" w:val="clear"/>
-                <w:vertAlign w:val="baseline"/>
-                <w:rtl w:val="0"/>
-              </w:rPr>
-              <w:t xml:space="preserve">SOLUCIÓN DE EJERCICIOS/PROBLEMAS</w:t>
-            </w:r>
-          </w:p>
-          <w:p>
-            <w:pPr>
-              <w:ind w:left="322" w:hanging="142"/>
-              <w:rPr>
-                <w:sz w:val="24"/>
-                <w:szCs w:val="24"/>
-              </w:rPr>
-            </w:pPr>
-            <w:r>
-              <w:rPr>
-                <w:rtl w:val="0"/>
-              </w:rPr>
-            </w:r>
-          </w:p>
-        </w:tc>
-      </w:tr>
-      <w:tr>
-        <w:trPr>
-          <w:cantSplit w:val="0"/>
-          <w:trHeight w:val="1088" w:hRule="atLeast"/>
-          <w:tblHeader w:val="0"/>
-        </w:trPr>
-        <w:tc>
-          <w:tcPr>
-            <w:shd w:fill="auto" w:val="clear"/>
-          </w:tcPr>
-          <w:p>
-            <w:pPr>
-              <w:keepNext w:val="0"/>
-              <w:keepLines w:val="0"/>
-              <w:widowControl w:val="1"/>
-              <w:numPr>
-                <w:ilvl w:val="0"/>
-                <w:numId w:val="3"/>
-              </w:numPr>
-              <w:pBdr>
-                <w:top w:space="0" w:sz="0" w:val="nil"/>
-                <w:left w:space="0" w:sz="0" w:val="nil"/>
-                <w:bottom w:space="0" w:sz="0" w:val="nil"/>
-                <w:right w:space="0" w:sz="0" w:val="nil"/>
-                <w:between w:space="0" w:sz="0" w:val="nil"/>
-              </w:pBdr>
-              <w:shd w:fill="auto" w:val="clear"/>
-              <w:spacing w:after="0" w:before="0" w:line="259" w:lineRule="auto"/>
-              <w:ind w:left="322" w:right="0" w:hanging="142"/>
-              <w:jc w:val="left"/>
-              <w:rPr>
-                <w:rFonts w:ascii="Calibri" w:cs="Calibri" w:eastAsia="Calibri" w:hAnsi="Calibri"/>
-                <w:b w:val="1"/>
-                <w:bCs w:val="1"/>
-                <w:i w:val="0"/>
-                <w:iCs w:val="0"/>
-                <w:smallCaps w:val="0"/>
-                <w:strike w:val="0"/>
-                <w:color w:val="000000"/>
-                <w:sz w:val="24"/>
-                <w:szCs w:val="24"/>
-                <w:u w:val="none"/>
-                <w:shd w:fill="auto" w:val="clear"/>
-                <w:vertAlign w:val="baseline"/>
-              </w:rPr>
-            </w:pPr>
-            <w:r>
-              <w:rPr>
-                <w:rFonts w:ascii="Calibri" w:cs="Calibri" w:eastAsia="Calibri" w:hAnsi="Calibri"/>
-                <w:b w:val="1"/>
-                <w:bCs w:val="1"/>
-                <w:i w:val="0"/>
-                <w:iCs w:val="0"/>
-                <w:smallCaps w:val="0"/>
-                <w:strike w:val="0"/>
-                <w:color w:val="000000"/>
-                <w:sz w:val="24"/>
-                <w:szCs w:val="24"/>
-                <w:u w:val="none"/>
-                <w:shd w:fill="auto" w:val="clear"/>
-                <w:vertAlign w:val="baseline"/>
-                <w:rtl w:val="0"/>
-              </w:rPr>
-              <w:t xml:space="preserve">SOLUCIÓN DEL CUESTIONARIO</w:t>
-            </w:r>
-            <w:r>
-              <w:rPr>
-                <w:rtl w:val="0"/>
-              </w:rPr>
-            </w:r>
-          </w:p>
-          <w:p>
-            <w:pPr>
-              <w:keepNext w:val="0"/>
-              <w:keepLines w:val="0"/>
-              <w:widowControl w:val="1"/>
-              <w:pBdr>
-                <w:top w:space="0" w:sz="0" w:val="nil"/>
-                <w:left w:space="0" w:sz="0" w:val="nil"/>
-                <w:bottom w:space="0" w:sz="0" w:val="nil"/>
-                <w:right w:space="0" w:sz="0" w:val="nil"/>
-                <w:between w:space="0" w:sz="0" w:val="nil"/>
-              </w:pBdr>
-              <w:shd w:fill="auto" w:val="clear"/>
-              <w:spacing w:after="160" w:before="0" w:line="259" w:lineRule="auto"/>
-              <w:ind w:left="856" w:right="0" w:firstLine="0"/>
-              <w:jc w:val="both"/>
-              <w:rPr>
-                <w:rFonts w:ascii="Calibri" w:cs="Calibri" w:eastAsia="Calibri" w:hAnsi="Calibri"/>
-                <w:b w:val="0"/>
-                <w:bCs w:val="0"/>
-                <w:i w:val="0"/>
-                <w:iCs w:val="0"/>
-                <w:smallCaps w:val="0"/>
-                <w:strike w:val="0"/>
-                <w:color w:val="000000"/>
-                <w:sz w:val="24"/>
-                <w:szCs w:val="24"/>
-                <w:u w:val="none"/>
-                <w:shd w:fill="auto" w:val="clear"/>
-                <w:vertAlign w:val="baseline"/>
-              </w:rPr>
-            </w:pPr>
-            <w:r>
-              <w:rPr>
-                <w:rtl w:val="0"/>
-              </w:rPr>
-            </w:r>
-          </w:p>
-        </w:tc>
-      </w:tr>
-      <w:tr>
-        <w:trPr>
-          <w:cantSplit w:val="0"/>
-          <w:trHeight w:val="1088" w:hRule="atLeast"/>
-          <w:tblHeader w:val="0"/>
-        </w:trPr>
-        <w:tc>
-          <w:tcPr>
-            <w:tcBorders>
-              <w:bottom w:color="000000" w:space="0" w:sz="4" w:val="single"/>
-            </w:tcBorders>
-            <w:shd w:fill="auto" w:val="clear"/>
-          </w:tcPr>
-          <w:p>
-            <w:pPr>
-              <w:keepNext w:val="0"/>
-              <w:keepLines w:val="0"/>
-              <w:widowControl w:val="1"/>
-              <w:numPr>
-                <w:ilvl w:val="0"/>
-                <w:numId w:val="3"/>
-              </w:numPr>
-              <w:pBdr>
-                <w:top w:space="0" w:sz="0" w:val="nil"/>
-                <w:left w:space="0" w:sz="0" w:val="nil"/>
-                <w:bottom w:space="0" w:sz="0" w:val="nil"/>
-                <w:right w:space="0" w:sz="0" w:val="nil"/>
-                <w:between w:space="0" w:sz="0" w:val="nil"/>
-              </w:pBdr>
-              <w:shd w:fill="auto" w:val="clear"/>
-              <w:spacing w:after="160" w:before="0" w:line="259" w:lineRule="auto"/>
-              <w:ind w:left="322" w:right="0" w:hanging="142"/>
-              <w:jc w:val="left"/>
-              <w:rPr>
-                <w:rFonts w:ascii="Calibri" w:cs="Calibri" w:eastAsia="Calibri" w:hAnsi="Calibri"/>
-                <w:b w:val="1"/>
-                <w:bCs w:val="1"/>
-                <w:i w:val="0"/>
-                <w:iCs w:val="0"/>
-                <w:smallCaps w:val="0"/>
-                <w:strike w:val="0"/>
-                <w:color w:val="000000"/>
-                <w:sz w:val="24"/>
-                <w:szCs w:val="24"/>
-                <w:u w:val="none"/>
-                <w:shd w:fill="auto" w:val="clear"/>
-                <w:vertAlign w:val="baseline"/>
-              </w:rPr>
-            </w:pPr>
-            <w:r>
-              <w:rPr>
-                <w:rFonts w:ascii="Calibri" w:cs="Calibri" w:eastAsia="Calibri" w:hAnsi="Calibri"/>
-                <w:b w:val="1"/>
-                <w:bCs w:val="1"/>
-                <w:i w:val="0"/>
-                <w:iCs w:val="0"/>
-                <w:smallCaps w:val="0"/>
-                <w:strike w:val="0"/>
-                <w:color w:val="000000"/>
-                <w:sz w:val="24"/>
-                <w:szCs w:val="24"/>
-                <w:u w:val="none"/>
-                <w:shd w:fill="auto" w:val="clear"/>
-                <w:vertAlign w:val="baseline"/>
-                <w:rtl w:val="0"/>
-              </w:rPr>
-              <w:t xml:space="preserve">CONCLUSIONES</w:t>
-            </w:r>
-          </w:p>
-          <w:p>
-            <w:pPr>
-              <w:numPr>
-                <w:ilvl w:val="0"/>
-                <w:numId w:val="1"/>
-              </w:numPr>
-              <w:ind w:left="720" w:hanging="360"/>
-              <w:rPr/>
-            </w:pPr>
-            <w:r>
-              <w:rPr>
-                <w:rtl w:val="0"/>
-              </w:rPr>
-              <w:t xml:space="preserve">xd</w:t>
-            </w:r>
-            <w:r>
-              <w:rPr>
-                <w:rtl w:val="0"/>
-              </w:rPr>
-            </w:r>
-          </w:p>
-          <w:p>
-            <w:pPr>
-              <w:ind w:left="180" w:firstLine="0"/>
-              <w:rPr>
-                <w:sz w:val="24"/>
-                <w:szCs w:val="24"/>
-              </w:rPr>
-            </w:pPr>
-            <w:r>
-              <w:rPr>
-                <w:rtl w:val="0"/>
-              </w:rPr>
+                <w:rFonts w:ascii="Calibri" w:hAnsi="Calibri"/>
+                <w:color w:val="1F2937"/>
+                <w:sz w:val="20"/>
+              </w:rPr>
+              <w:t>C:\Users\diego\anaconda3\Scripts\conda.exe create -y -n lab08-cgvc python=3.11 notebook ipykernel nbconvert numpy matplotlib opencv pillow</w:t>
+            </w:r>
+            <w:r>
+              <w:br/>
+            </w:r>
+            <w:r>
+              <w:rPr>
+                <w:rFonts w:ascii="Calibri" w:hAnsi="Calibri"/>
+                <w:color w:val="1F2937"/>
+                <w:sz w:val="20"/>
+              </w:rPr>
+              <w:t>C:\Users\diego\anaconda3\Scripts\conda.exe run -n lab08-cgvc python -m ipykernel install --user --name lab08-cgvc --display-name "Python (lab08-cgvc)"</w:t>
+            </w:r>
+            <w:r>
+              <w:br/>
+            </w:r>
+            <w:r>
+              <w:rPr>
+                <w:rFonts w:ascii="Calibri" w:hAnsi="Calibri"/>
+                <w:color w:val="1F2937"/>
+                <w:sz w:val="20"/>
+              </w:rPr>
+              <w:t>C:\Users\diego\anaconda3\Scripts\conda.exe run -n lab08-cgvc jupyter nbconvert --to notebook --execute notebooks\Laboratorio_08_Procesamiento_Imagenes.ipynb --inplace</w:t>
             </w:r>
           </w:p>
         </w:tc>
@@ -1044,108 +1045,268 @@
     </w:tbl>
     <w:p>
       <w:pPr>
-        <w:rPr/>
-      </w:pPr>
-      <w:r>
-        <w:rPr>
-          <w:rtl w:val="0"/>
-        </w:rPr>
+        <w:spacing w:before="0" w:after="40" w:line="240" w:lineRule="auto"/>
+        <w:jc w:val="center"/>
+      </w:pPr>
+      <w:r>
+        <w:drawing>
+          <wp:inline>
+            <wp:extent cx="5715000" cy="1704216"/>
+            <wp:docPr id="1" name="Picture 1"/>
+            <wp:cNvGraphicFramePr>
+              <a:graphicFrameLocks noChangeAspect="1"/>
+            </wp:cNvGraphicFramePr>
+            <a:graphic>
+              <a:graphicData uri="http://schemas.openxmlformats.org/drawingml/2006/picture">
+                <pic:pic>
+                  <pic:nvPicPr>
+                    <pic:cNvPr id="0" name="00_imagenes_base.png"/>
+                    <pic:cNvPicPr/>
+                  </pic:nvPicPr>
+                  <pic:blipFill>
+                    <a:blip r:embed="rId9"/>
+                    <a:stretch>
+                      <a:fillRect/>
+                    </a:stretch>
+                  </pic:blipFill>
+                  <pic:spPr>
+                    <a:xfrm>
+                      <a:off x="0" y="0"/>
+                      <a:ext cx="5715000" cy="1704216"/>
+                    </a:xfrm>
+                    <a:prstGeom prst="rect"/>
+                  </pic:spPr>
+                </pic:pic>
+              </a:graphicData>
+            </a:graphic>
+          </wp:inline>
+        </w:drawing>
+      </w:r>
+    </w:p>
+    <w:p>
+      <w:pPr>
+        <w:spacing w:before="0" w:after="200" w:line="240" w:lineRule="auto"/>
+        <w:jc w:val="center"/>
+      </w:pPr>
+      <w:r>
+        <w:rPr>
+          <w:rFonts w:ascii="Calibri" w:hAnsi="Calibri"/>
+          <w:i/>
+          <w:color w:val="555555"/>
+          <w:sz w:val="18"/>
+        </w:rPr>
+        <w:t>Figura 1. Imagenes base generadas para el laboratorio.</w:t>
+      </w:r>
+    </w:p>
+    <w:p>
+      <w:pPr>
+        <w:pStyle w:val="Heading1"/>
+        <w:spacing w:before="360" w:after="200" w:line="300" w:lineRule="auto"/>
+      </w:pPr>
+      <w:r>
+        <w:rPr>
+          <w:rFonts w:ascii="Calibri" w:hAnsi="Calibri"/>
+          <w:b/>
+          <w:color w:val="2E74B5"/>
+          <w:sz w:val="32"/>
+        </w:rPr>
+        <w:t>Solucion de ejercicios propuestos</w:t>
+      </w:r>
+    </w:p>
+    <w:p>
+      <w:pPr>
+        <w:pStyle w:val="Heading2"/>
+        <w:spacing w:before="280" w:after="140" w:line="300" w:lineRule="auto"/>
+      </w:pPr>
+      <w:r>
+        <w:rPr>
+          <w:rFonts w:ascii="Calibri" w:hAnsi="Calibri"/>
+          <w:b/>
+          <w:color w:val="2E74B5"/>
+          <w:sz w:val="26"/>
+        </w:rPr>
+        <w:t>1. Redimensionar imagenes sin deformarlas</w:t>
+      </w:r>
+    </w:p>
+    <w:p>
+      <w:pPr>
+        <w:spacing w:before="0" w:after="120" w:line="300" w:lineRule="auto"/>
+      </w:pPr>
+      <w:r>
+        <w:rPr>
+          <w:rFonts w:ascii="Calibri" w:hAnsi="Calibri"/>
+          <w:b/>
+        </w:rPr>
+        <w:t xml:space="preserve">Descripcion: </w:t>
+      </w:r>
+      <w:r>
+        <w:rPr>
+          <w:rFonts w:ascii="Calibri" w:hAnsi="Calibri"/>
+        </w:rPr>
+        <w:t>Se cargaron tres imagenes a color de distintos tamanos y se selecciono como referencia la de mayor area. Las dos menores se escalaron con relacion de aspecto constante y se rellenaron los espacios libres con bordes negros.</w:t>
+      </w:r>
+    </w:p>
+    <w:p>
+      <w:pPr>
+        <w:spacing w:before="0" w:after="120" w:line="300" w:lineRule="auto"/>
+      </w:pPr>
+      <w:r>
+        <w:rPr>
+          <w:rFonts w:ascii="Calibri" w:hAnsi="Calibri"/>
+          <w:b/>
+        </w:rPr>
+        <w:t xml:space="preserve">Funcion o aprendizaje relevante: </w:t>
+      </w:r>
+      <w:r>
+        <w:rPr>
+          <w:rFonts w:ascii="Calibri" w:hAnsi="Calibri"/>
+        </w:rPr>
+        <w:t>La clave fue calcular un unico factor de escala con `min(ancho_objetivo/ancho, alto_objetivo/alto)` para evitar deformaciones.</w:t>
+      </w:r>
+    </w:p>
+    <w:p>
+      <w:pPr>
+        <w:spacing w:before="0" w:after="120" w:line="300" w:lineRule="auto"/>
+      </w:pPr>
+      <w:r>
+        <w:rPr>
+          <w:rFonts w:ascii="Calibri" w:hAnsi="Calibri"/>
+        </w:rPr>
+        <w:t>Fragmento de codigo principal:</w:t>
       </w:r>
     </w:p>
     <w:tbl>
       <w:tblPr>
-        <w:tblStyle w:val="Table3"/>
-        <w:tblW w:w="10266.0" w:type="dxa"/>
-        <w:jc w:val="left"/>
-        <w:tblInd w:w="-397.0" w:type="dxa"/>
-        <w:tblBorders>
-          <w:top w:color="000000" w:space="0" w:sz="4" w:val="single"/>
-          <w:left w:color="000000" w:space="0" w:sz="4" w:val="single"/>
-          <w:bottom w:color="000000" w:space="0" w:sz="4" w:val="single"/>
-          <w:right w:color="000000" w:space="0" w:sz="4" w:val="single"/>
-          <w:insideH w:color="000000" w:space="0" w:sz="4" w:val="single"/>
-          <w:insideV w:color="000000" w:space="0" w:sz="4" w:val="single"/>
-        </w:tblBorders>
-        <w:tblLayout w:type="fixed"/>
-        <w:tblLook w:val="0400"/>
+        <w:tblW w:type="auto" w:w="0"/>
+        <w:jc w:val="center"/>
+        <w:tblLook w:firstColumn="1" w:firstRow="1" w:lastColumn="0" w:lastRow="0" w:noHBand="0" w:noVBand="1" w:val="04A0"/>
       </w:tblPr>
       <w:tblGrid>
-        <w:gridCol w:w="10266"/>
-        <w:tblGridChange w:id="0">
-          <w:tblGrid>
-            <w:gridCol w:w="10266"/>
-          </w:tblGrid>
-        </w:tblGridChange>
+        <w:gridCol w:w="9026"/>
       </w:tblGrid>
       <w:tr>
-        <w:trPr>
-          <w:cantSplit w:val="0"/>
-          <w:trHeight w:val="397" w:hRule="atLeast"/>
-          <w:tblHeader w:val="0"/>
-        </w:trPr>
         <w:tc>
           <w:tcPr>
-            <w:shd w:fill="c8310e" w:val="clear"/>
+            <w:tcW w:type="dxa" w:w="9026"/>
+            <w:shd w:fill="F2F4F7"/>
+            <w:tcMar>
+              <w:top w:w="80" w:type="dxa"/>
+              <w:start w:w="120" w:type="dxa"/>
+              <w:bottom w:w="80" w:type="dxa"/>
+              <w:end w:w="120" w:type="dxa"/>
+            </w:tcMar>
             <w:vAlign w:val="center"/>
           </w:tcPr>
           <w:p>
             <w:pPr>
-              <w:jc w:val="center"/>
-              <w:rPr>
-                <w:b w:val="1"/>
-                <w:bCs w:val="1"/>
-              </w:rPr>
+              <w:spacing w:before="0" w:after="0"/>
             </w:pPr>
             <w:r>
               <w:rPr>
-                <w:b w:val="1"/>
-                <w:bCs w:val="1"/>
-                <w:color w:val="ffffff"/>
-                <w:sz w:val="24"/>
-                <w:szCs w:val="24"/>
-                <w:rtl w:val="0"/>
-              </w:rPr>
-              <w:t xml:space="preserve">RETROALIMENTACIÓN GENERAL</w:t>
-            </w:r>
-            <w:r>
-              <w:rPr>
-                <w:rtl w:val="0"/>
-              </w:rPr>
-            </w:r>
-          </w:p>
-        </w:tc>
-      </w:tr>
-      <w:tr>
-        <w:trPr>
-          <w:cantSplit w:val="0"/>
-          <w:trHeight w:val="1088" w:hRule="atLeast"/>
-          <w:tblHeader w:val="0"/>
-        </w:trPr>
-        <w:tc>
-          <w:tcPr>
-            <w:tcBorders>
-              <w:bottom w:color="000000" w:space="0" w:sz="4" w:val="single"/>
-            </w:tcBorders>
-            <w:shd w:fill="auto" w:val="clear"/>
-          </w:tcPr>
-          <w:p>
-            <w:pPr>
-              <w:rPr/>
-            </w:pPr>
-            <w:r>
-              <w:rPr>
-                <w:rtl w:val="0"/>
-              </w:rPr>
-            </w:r>
-          </w:p>
-          <w:p>
-            <w:pPr>
-              <w:rPr/>
-            </w:pPr>
-            <w:r>
-              <w:rPr>
-                <w:rtl w:val="0"/>
-              </w:rPr>
+                <w:rFonts w:ascii="Calibri" w:hAnsi="Calibri"/>
+                <w:color w:val="1F2937"/>
+                <w:sz w:val="20"/>
+              </w:rPr>
+              <w:t>def resize_with_letterbox(image, target_width, target_height):</w:t>
+            </w:r>
+            <w:r>
+              <w:br/>
+            </w:r>
+            <w:r>
+              <w:rPr>
+                <w:rFonts w:ascii="Calibri" w:hAnsi="Calibri"/>
+                <w:color w:val="1F2937"/>
+                <w:sz w:val="20"/>
+              </w:rPr>
+              <w:t xml:space="preserve">    scale = min(target_width / image.shape[1], target_height / image.shape[0])</w:t>
+            </w:r>
+            <w:r>
+              <w:br/>
+            </w:r>
+            <w:r>
+              <w:rPr>
+                <w:rFonts w:ascii="Calibri" w:hAnsi="Calibri"/>
+                <w:color w:val="1F2937"/>
+                <w:sz w:val="20"/>
+              </w:rPr>
+              <w:t xml:space="preserve">    new_w = int(round(image.shape[1] * scale))</w:t>
+            </w:r>
+            <w:r>
+              <w:br/>
+            </w:r>
+            <w:r>
+              <w:rPr>
+                <w:rFonts w:ascii="Calibri" w:hAnsi="Calibri"/>
+                <w:color w:val="1F2937"/>
+                <w:sz w:val="20"/>
+              </w:rPr>
+              <w:t xml:space="preserve">    new_h = int(round(image.shape[0] * scale))</w:t>
+            </w:r>
+            <w:r>
+              <w:br/>
+            </w:r>
+            <w:r>
+              <w:rPr>
+                <w:rFonts w:ascii="Calibri" w:hAnsi="Calibri"/>
+                <w:color w:val="1F2937"/>
+                <w:sz w:val="20"/>
+              </w:rPr>
+              <w:t xml:space="preserve">    resized = cv2.resize(image, (new_w, new_h), interpolation=cv2.INTER_AREA)</w:t>
+            </w:r>
+            <w:r>
+              <w:br/>
+            </w:r>
+            <w:r>
+              <w:rPr>
+                <w:rFonts w:ascii="Calibri" w:hAnsi="Calibri"/>
+                <w:color w:val="1F2937"/>
+                <w:sz w:val="20"/>
+              </w:rPr>
+              <w:t xml:space="preserve">    canvas = np.zeros((target_height, target_width, 3), dtype=np.uint8)</w:t>
+            </w:r>
+            <w:r>
+              <w:br/>
+            </w:r>
+            <w:r>
+              <w:rPr>
+                <w:rFonts w:ascii="Calibri" w:hAnsi="Calibri"/>
+                <w:color w:val="1F2937"/>
+                <w:sz w:val="20"/>
+              </w:rPr>
+              <w:t xml:space="preserve">    x0 = (target_width - new_w) // 2</w:t>
+            </w:r>
+            <w:r>
+              <w:br/>
+            </w:r>
+            <w:r>
+              <w:rPr>
+                <w:rFonts w:ascii="Calibri" w:hAnsi="Calibri"/>
+                <w:color w:val="1F2937"/>
+                <w:sz w:val="20"/>
+              </w:rPr>
+              <w:t xml:space="preserve">    y0 = (target_height - new_h) // 2</w:t>
+            </w:r>
+            <w:r>
+              <w:br/>
+            </w:r>
+            <w:r>
+              <w:rPr>
+                <w:rFonts w:ascii="Calibri" w:hAnsi="Calibri"/>
+                <w:color w:val="1F2937"/>
+                <w:sz w:val="20"/>
+              </w:rPr>
+              <w:t xml:space="preserve">    canvas[y0:y0 + new_h, x0:x0 + new_w] = resized</w:t>
+            </w:r>
+            <w:r>
+              <w:br/>
+            </w:r>
+            <w:r>
+              <w:rPr>
+                <w:rFonts w:ascii="Calibri" w:hAnsi="Calibri"/>
+                <w:color w:val="1F2937"/>
+                <w:sz w:val="20"/>
+              </w:rPr>
+              <w:t xml:space="preserve">    return canvas</w:t>
             </w:r>
           </w:p>
         </w:tc>
@@ -1153,110 +1314,187 @@
     </w:tbl>
     <w:p>
       <w:pPr>
-        <w:rPr/>
-      </w:pPr>
-      <w:r>
-        <w:rPr>
-          <w:rtl w:val="0"/>
-        </w:rPr>
+        <w:spacing w:before="0" w:after="40" w:line="240" w:lineRule="auto"/>
+        <w:jc w:val="center"/>
+      </w:pPr>
+      <w:r>
+        <w:drawing>
+          <wp:inline>
+            <wp:extent cx="5715000" cy="1495596"/>
+            <wp:docPr id="2" name="Picture 2"/>
+            <wp:cNvGraphicFramePr>
+              <a:graphicFrameLocks noChangeAspect="1"/>
+            </wp:cNvGraphicFramePr>
+            <a:graphic>
+              <a:graphicData uri="http://schemas.openxmlformats.org/drawingml/2006/picture">
+                <pic:pic>
+                  <pic:nvPicPr>
+                    <pic:cNvPr id="0" name="01_redimension_aspect_ratio.png"/>
+                    <pic:cNvPicPr/>
+                  </pic:nvPicPr>
+                  <pic:blipFill>
+                    <a:blip r:embed="rId10"/>
+                    <a:stretch>
+                      <a:fillRect/>
+                    </a:stretch>
+                  </pic:blipFill>
+                  <pic:spPr>
+                    <a:xfrm>
+                      <a:off x="0" y="0"/>
+                      <a:ext cx="5715000" cy="1495596"/>
+                    </a:xfrm>
+                    <a:prstGeom prst="rect"/>
+                  </pic:spPr>
+                </pic:pic>
+              </a:graphicData>
+            </a:graphic>
+          </wp:inline>
+        </w:drawing>
+      </w:r>
+    </w:p>
+    <w:p>
+      <w:pPr>
+        <w:spacing w:before="0" w:after="200" w:line="240" w:lineRule="auto"/>
+        <w:jc w:val="center"/>
+      </w:pPr>
+      <w:r>
+        <w:rPr>
+          <w:rFonts w:ascii="Calibri" w:hAnsi="Calibri"/>
+          <w:i/>
+          <w:color w:val="555555"/>
+          <w:sz w:val="18"/>
+        </w:rPr>
+        <w:t>Captura - 1. Redimensionar imagenes sin deformarlas</w:t>
+      </w:r>
+    </w:p>
+    <w:p>
+      <w:pPr>
+        <w:pStyle w:val="Heading2"/>
+        <w:spacing w:before="280" w:after="140" w:line="300" w:lineRule="auto"/>
+      </w:pPr>
+      <w:r>
+        <w:rPr>
+          <w:rFonts w:ascii="Calibri" w:hAnsi="Calibri"/>
+          <w:b/>
+          <w:color w:val="2E74B5"/>
+          <w:sz w:val="26"/>
+        </w:rPr>
+        <w:t>2. Crear nueva imagen con canales de color combinados</w:t>
+      </w:r>
+    </w:p>
+    <w:p>
+      <w:pPr>
+        <w:spacing w:before="0" w:after="120" w:line="300" w:lineRule="auto"/>
+      </w:pPr>
+      <w:r>
+        <w:rPr>
+          <w:rFonts w:ascii="Calibri" w:hAnsi="Calibri"/>
+          <w:b/>
+        </w:rPr>
+        <w:t xml:space="preserve">Descripcion: </w:t>
+      </w:r>
+      <w:r>
+        <w:rPr>
+          <w:rFonts w:ascii="Calibri" w:hAnsi="Calibri"/>
+        </w:rPr>
+        <w:t>Se construyo una imagen nueva tomando el canal rojo de la persona, el canal verde del gato y el canal azul del perro. Como OpenCV usa BGR, el orden de fusion fue azul, verde y rojo.</w:t>
+      </w:r>
+    </w:p>
+    <w:p>
+      <w:pPr>
+        <w:spacing w:before="0" w:after="120" w:line="300" w:lineRule="auto"/>
+      </w:pPr>
+      <w:r>
+        <w:rPr>
+          <w:rFonts w:ascii="Calibri" w:hAnsi="Calibri"/>
+          <w:b/>
+        </w:rPr>
+        <w:t xml:space="preserve">Funcion o aprendizaje relevante: </w:t>
+      </w:r>
+      <w:r>
+        <w:rPr>
+          <w:rFonts w:ascii="Calibri" w:hAnsi="Calibri"/>
+        </w:rPr>
+        <w:t>`cv2.split` separa canales y `cv2.merge` reconstruye la imagen. En OpenCV el canal rojo esta en el indice 2.</w:t>
+      </w:r>
+    </w:p>
+    <w:p>
+      <w:pPr>
+        <w:spacing w:before="0" w:after="120" w:line="300" w:lineRule="auto"/>
+      </w:pPr>
+      <w:r>
+        <w:rPr>
+          <w:rFonts w:ascii="Calibri" w:hAnsi="Calibri"/>
+        </w:rPr>
+        <w:t>Fragmento de codigo principal:</w:t>
       </w:r>
     </w:p>
     <w:tbl>
       <w:tblPr>
-        <w:tblStyle w:val="Table4"/>
-        <w:tblW w:w="10266.0" w:type="dxa"/>
-        <w:jc w:val="left"/>
-        <w:tblInd w:w="-397.0" w:type="dxa"/>
-        <w:tblBorders>
-          <w:top w:color="000000" w:space="0" w:sz="4" w:val="single"/>
-          <w:left w:color="000000" w:space="0" w:sz="4" w:val="single"/>
-          <w:bottom w:color="000000" w:space="0" w:sz="4" w:val="single"/>
-          <w:right w:color="000000" w:space="0" w:sz="4" w:val="single"/>
-          <w:insideH w:color="000000" w:space="0" w:sz="4" w:val="single"/>
-          <w:insideV w:color="000000" w:space="0" w:sz="4" w:val="single"/>
-        </w:tblBorders>
-        <w:tblLayout w:type="fixed"/>
-        <w:tblLook w:val="0400"/>
+        <w:tblW w:type="auto" w:w="0"/>
+        <w:jc w:val="center"/>
+        <w:tblLook w:firstColumn="1" w:firstRow="1" w:lastColumn="0" w:lastRow="0" w:noHBand="0" w:noVBand="1" w:val="04A0"/>
       </w:tblPr>
       <w:tblGrid>
-        <w:gridCol w:w="10266"/>
-        <w:tblGridChange w:id="0">
-          <w:tblGrid>
-            <w:gridCol w:w="10266"/>
-          </w:tblGrid>
-        </w:tblGridChange>
+        <w:gridCol w:w="9026"/>
       </w:tblGrid>
       <w:tr>
-        <w:trPr>
-          <w:cantSplit w:val="0"/>
-          <w:trHeight w:val="397" w:hRule="atLeast"/>
-          <w:tblHeader w:val="0"/>
-        </w:trPr>
         <w:tc>
           <w:tcPr>
-            <w:shd w:fill="c8310e" w:val="clear"/>
+            <w:tcW w:type="dxa" w:w="9026"/>
+            <w:shd w:fill="F2F4F7"/>
+            <w:tcMar>
+              <w:top w:w="80" w:type="dxa"/>
+              <w:start w:w="120" w:type="dxa"/>
+              <w:bottom w:w="80" w:type="dxa"/>
+              <w:end w:w="120" w:type="dxa"/>
+            </w:tcMar>
             <w:vAlign w:val="center"/>
           </w:tcPr>
           <w:p>
             <w:pPr>
-              <w:jc w:val="center"/>
-              <w:rPr>
-                <w:b w:val="1"/>
-                <w:bCs w:val="1"/>
-              </w:rPr>
+              <w:spacing w:before="0" w:after="0"/>
             </w:pPr>
             <w:r>
               <w:rPr>
-                <w:b w:val="1"/>
-                <w:bCs w:val="1"/>
-                <w:color w:val="ffffff"/>
-                <w:sz w:val="24"/>
-                <w:szCs w:val="24"/>
-                <w:rtl w:val="0"/>
-              </w:rPr>
-              <w:t xml:space="preserve">REFERENCIAS Y BIBLIOGRAFÍA</w:t>
-            </w:r>
-            <w:r>
-              <w:rPr>
-                <w:rtl w:val="0"/>
-              </w:rPr>
-            </w:r>
-          </w:p>
-        </w:tc>
-      </w:tr>
-      <w:tr>
-        <w:trPr>
-          <w:cantSplit w:val="0"/>
-          <w:trHeight w:val="1441" w:hRule="atLeast"/>
-          <w:tblHeader w:val="0"/>
-        </w:trPr>
-        <w:tc>
-          <w:tcPr>
-            <w:shd w:fill="auto" w:val="clear"/>
-          </w:tcPr>
-          <w:p>
-            <w:pPr>
-              <w:numPr>
-                <w:ilvl w:val="0"/>
-                <w:numId w:val="2"/>
-              </w:numPr>
-              <w:spacing w:after="240" w:before="240" w:lineRule="auto"/>
-              <w:ind w:left="720" w:hanging="360"/>
-              <w:jc w:val="both"/>
-              <w:rPr>
-                <w:i w:val="1"/>
-                <w:iCs w:val="1"/>
-                <w:color w:val="2f5496"/>
-              </w:rPr>
-            </w:pPr>
-            <w:r>
-              <w:rPr>
-                <w:i w:val="1"/>
-                <w:iCs w:val="1"/>
-                <w:color w:val="2f5496"/>
-                <w:rtl w:val="0"/>
-              </w:rPr>
-              <w:t xml:space="preserve">xd</w:t>
+                <w:rFonts w:ascii="Calibri" w:hAnsi="Calibri"/>
+                <w:color w:val="1F2937"/>
+                <w:sz w:val="20"/>
+              </w:rPr>
+              <w:t>b_perro = cv2.split(resized_images["perro"])[0]</w:t>
+            </w:r>
+            <w:r>
+              <w:br/>
+            </w:r>
+            <w:r>
+              <w:rPr>
+                <w:rFonts w:ascii="Calibri" w:hAnsi="Calibri"/>
+                <w:color w:val="1F2937"/>
+                <w:sz w:val="20"/>
+              </w:rPr>
+              <w:t>g_gato = cv2.split(resized_images["gato"])[1]</w:t>
+            </w:r>
+            <w:r>
+              <w:br/>
+            </w:r>
+            <w:r>
+              <w:rPr>
+                <w:rFonts w:ascii="Calibri" w:hAnsi="Calibri"/>
+                <w:color w:val="1F2937"/>
+                <w:sz w:val="20"/>
+              </w:rPr>
+              <w:t>r_persona = cv2.split(resized_images["persona"])[2]</w:t>
+            </w:r>
+            <w:r>
+              <w:br/>
+            </w:r>
+            <w:r>
+              <w:rPr>
+                <w:rFonts w:ascii="Calibri" w:hAnsi="Calibri"/>
+                <w:color w:val="1F2937"/>
+                <w:sz w:val="20"/>
+              </w:rPr>
+              <w:t>combined = cv2.merge([b_perro, g_gato, r_persona])</w:t>
             </w:r>
           </w:p>
         </w:tc>
@@ -1264,32 +1502,1412 @@
     </w:tbl>
     <w:p>
       <w:pPr>
-        <w:rPr/>
-      </w:pPr>
-      <w:r>
-        <w:rPr>
-          <w:rtl w:val="0"/>
-        </w:rPr>
-      </w:r>
-    </w:p>
-    <w:p>
-      <w:pPr>
-        <w:rPr/>
-      </w:pPr>
-      <w:r>
-        <w:rPr>
-          <w:rtl w:val="0"/>
-        </w:rPr>
+        <w:spacing w:before="0" w:after="40" w:line="240" w:lineRule="auto"/>
+        <w:jc w:val="center"/>
+      </w:pPr>
+      <w:r>
+        <w:drawing>
+          <wp:inline>
+            <wp:extent cx="5715000" cy="1134784"/>
+            <wp:docPr id="3" name="Picture 3"/>
+            <wp:cNvGraphicFramePr>
+              <a:graphicFrameLocks noChangeAspect="1"/>
+            </wp:cNvGraphicFramePr>
+            <a:graphic>
+              <a:graphicData uri="http://schemas.openxmlformats.org/drawingml/2006/picture">
+                <pic:pic>
+                  <pic:nvPicPr>
+                    <pic:cNvPr id="0" name="02_canales_combinados.png"/>
+                    <pic:cNvPicPr/>
+                  </pic:nvPicPr>
+                  <pic:blipFill>
+                    <a:blip r:embed="rId11"/>
+                    <a:stretch>
+                      <a:fillRect/>
+                    </a:stretch>
+                  </pic:blipFill>
+                  <pic:spPr>
+                    <a:xfrm>
+                      <a:off x="0" y="0"/>
+                      <a:ext cx="5715000" cy="1134784"/>
+                    </a:xfrm>
+                    <a:prstGeom prst="rect"/>
+                  </pic:spPr>
+                </pic:pic>
+              </a:graphicData>
+            </a:graphic>
+          </wp:inline>
+        </w:drawing>
+      </w:r>
+    </w:p>
+    <w:p>
+      <w:pPr>
+        <w:spacing w:before="0" w:after="200" w:line="240" w:lineRule="auto"/>
+        <w:jc w:val="center"/>
+      </w:pPr>
+      <w:r>
+        <w:rPr>
+          <w:rFonts w:ascii="Calibri" w:hAnsi="Calibri"/>
+          <w:i/>
+          <w:color w:val="555555"/>
+          <w:sz w:val="18"/>
+        </w:rPr>
+        <w:t>Captura - 2. Crear nueva imagen con canales de color combinados</w:t>
+      </w:r>
+    </w:p>
+    <w:p>
+      <w:pPr>
+        <w:pStyle w:val="Heading2"/>
+        <w:spacing w:before="280" w:after="140" w:line="300" w:lineRule="auto"/>
+      </w:pPr>
+      <w:r>
+        <w:rPr>
+          <w:rFonts w:ascii="Calibri" w:hAnsi="Calibri"/>
+          <w:b/>
+          <w:color w:val="2E74B5"/>
+          <w:sz w:val="26"/>
+        </w:rPr>
+        <w:t>3. Conversion a negativo y escala de grises</w:t>
+      </w:r>
+    </w:p>
+    <w:p>
+      <w:pPr>
+        <w:spacing w:before="0" w:after="120" w:line="300" w:lineRule="auto"/>
+      </w:pPr>
+      <w:r>
+        <w:rPr>
+          <w:rFonts w:ascii="Calibri" w:hAnsi="Calibri"/>
+          <w:b/>
+        </w:rPr>
+        <w:t xml:space="preserve">Descripcion: </w:t>
+      </w:r>
+      <w:r>
+        <w:rPr>
+          <w:rFonts w:ascii="Calibri" w:hAnsi="Calibri"/>
+        </w:rPr>
+        <w:t>La imagen combinada se invirtio pixel por pixel para obtener el negativo y luego se convirtio a escala de grises para generar una version de una sola intensidad.</w:t>
+      </w:r>
+    </w:p>
+    <w:p>
+      <w:pPr>
+        <w:spacing w:before="0" w:after="120" w:line="300" w:lineRule="auto"/>
+      </w:pPr>
+      <w:r>
+        <w:rPr>
+          <w:rFonts w:ascii="Calibri" w:hAnsi="Calibri"/>
+          <w:b/>
+        </w:rPr>
+        <w:t xml:space="preserve">Funcion o aprendizaje relevante: </w:t>
+      </w:r>
+      <w:r>
+        <w:rPr>
+          <w:rFonts w:ascii="Calibri" w:hAnsi="Calibri"/>
+        </w:rPr>
+        <w:t>`cv2.bitwise_not` realiza la inversion de 0-255 y `cv2.cvtColor(..., cv2.COLOR_BGR2GRAY)` transforma la imagen a grises.</w:t>
+      </w:r>
+    </w:p>
+    <w:p>
+      <w:pPr>
+        <w:spacing w:before="0" w:after="120" w:line="300" w:lineRule="auto"/>
+      </w:pPr>
+      <w:r>
+        <w:rPr>
+          <w:rFonts w:ascii="Calibri" w:hAnsi="Calibri"/>
+        </w:rPr>
+        <w:t>Fragmento de codigo principal:</w:t>
+      </w:r>
+    </w:p>
+    <w:tbl>
+      <w:tblPr>
+        <w:tblW w:type="auto" w:w="0"/>
+        <w:jc w:val="center"/>
+        <w:tblLook w:firstColumn="1" w:firstRow="1" w:lastColumn="0" w:lastRow="0" w:noHBand="0" w:noVBand="1" w:val="04A0"/>
+      </w:tblPr>
+      <w:tblGrid>
+        <w:gridCol w:w="9026"/>
+      </w:tblGrid>
+      <w:tr>
+        <w:tc>
+          <w:tcPr>
+            <w:tcW w:type="dxa" w:w="9026"/>
+            <w:shd w:fill="F2F4F7"/>
+            <w:tcMar>
+              <w:top w:w="80" w:type="dxa"/>
+              <w:start w:w="120" w:type="dxa"/>
+              <w:bottom w:w="80" w:type="dxa"/>
+              <w:end w:w="120" w:type="dxa"/>
+            </w:tcMar>
+            <w:vAlign w:val="center"/>
+          </w:tcPr>
+          <w:p>
+            <w:pPr>
+              <w:spacing w:before="0" w:after="0"/>
+            </w:pPr>
+            <w:r>
+              <w:rPr>
+                <w:rFonts w:ascii="Calibri" w:hAnsi="Calibri"/>
+                <w:color w:val="1F2937"/>
+                <w:sz w:val="20"/>
+              </w:rPr>
+              <w:t>negative = cv2.bitwise_not(combined)</w:t>
+            </w:r>
+            <w:r>
+              <w:br/>
+            </w:r>
+            <w:r>
+              <w:rPr>
+                <w:rFonts w:ascii="Calibri" w:hAnsi="Calibri"/>
+                <w:color w:val="1F2937"/>
+                <w:sz w:val="20"/>
+              </w:rPr>
+              <w:t>gray_negative = cv2.cvtColor(negative, cv2.COLOR_BGR2GRAY)</w:t>
+            </w:r>
+            <w:r>
+              <w:br/>
+            </w:r>
+            <w:r>
+              <w:rPr>
+                <w:rFonts w:ascii="Calibri" w:hAnsi="Calibri"/>
+                <w:color w:val="1F2937"/>
+                <w:sz w:val="20"/>
+              </w:rPr>
+              <w:t>cv2.imwrite(str(RESULTS_DIR / "03_negativo.png"), negative)</w:t>
+            </w:r>
+            <w:r>
+              <w:br/>
+            </w:r>
+            <w:r>
+              <w:rPr>
+                <w:rFonts w:ascii="Calibri" w:hAnsi="Calibri"/>
+                <w:color w:val="1F2937"/>
+                <w:sz w:val="20"/>
+              </w:rPr>
+              <w:t>cv2.imwrite(str(RESULTS_DIR / "03_negativo_grises.png"), gray_negative)</w:t>
+            </w:r>
+          </w:p>
+        </w:tc>
+      </w:tr>
+    </w:tbl>
+    <w:p>
+      <w:pPr>
+        <w:spacing w:before="0" w:after="40" w:line="240" w:lineRule="auto"/>
+        <w:jc w:val="center"/>
+      </w:pPr>
+      <w:r>
+        <w:drawing>
+          <wp:inline>
+            <wp:extent cx="5715000" cy="1495596"/>
+            <wp:docPr id="4" name="Picture 4"/>
+            <wp:cNvGraphicFramePr>
+              <a:graphicFrameLocks noChangeAspect="1"/>
+            </wp:cNvGraphicFramePr>
+            <a:graphic>
+              <a:graphicData uri="http://schemas.openxmlformats.org/drawingml/2006/picture">
+                <pic:pic>
+                  <pic:nvPicPr>
+                    <pic:cNvPr id="0" name="03_negativo_y_grises.png"/>
+                    <pic:cNvPicPr/>
+                  </pic:nvPicPr>
+                  <pic:blipFill>
+                    <a:blip r:embed="rId12"/>
+                    <a:stretch>
+                      <a:fillRect/>
+                    </a:stretch>
+                  </pic:blipFill>
+                  <pic:spPr>
+                    <a:xfrm>
+                      <a:off x="0" y="0"/>
+                      <a:ext cx="5715000" cy="1495596"/>
+                    </a:xfrm>
+                    <a:prstGeom prst="rect"/>
+                  </pic:spPr>
+                </pic:pic>
+              </a:graphicData>
+            </a:graphic>
+          </wp:inline>
+        </w:drawing>
+      </w:r>
+    </w:p>
+    <w:p>
+      <w:pPr>
+        <w:spacing w:before="0" w:after="200" w:line="240" w:lineRule="auto"/>
+        <w:jc w:val="center"/>
+      </w:pPr>
+      <w:r>
+        <w:rPr>
+          <w:rFonts w:ascii="Calibri" w:hAnsi="Calibri"/>
+          <w:i/>
+          <w:color w:val="555555"/>
+          <w:sz w:val="18"/>
+        </w:rPr>
+        <w:t>Captura - 3. Conversion a negativo y escala de grises</w:t>
+      </w:r>
+    </w:p>
+    <w:p>
+      <w:pPr>
+        <w:pStyle w:val="Heading2"/>
+        <w:spacing w:before="280" w:after="140" w:line="300" w:lineRule="auto"/>
+      </w:pPr>
+      <w:r>
+        <w:rPr>
+          <w:rFonts w:ascii="Calibri" w:hAnsi="Calibri"/>
+          <w:b/>
+          <w:color w:val="2E74B5"/>
+          <w:sz w:val="26"/>
+        </w:rPr>
+        <w:t>4. Aplicacion interactiva de visualizacion de canales</w:t>
+      </w:r>
+    </w:p>
+    <w:p>
+      <w:pPr>
+        <w:spacing w:before="0" w:after="120" w:line="300" w:lineRule="auto"/>
+      </w:pPr>
+      <w:r>
+        <w:rPr>
+          <w:rFonts w:ascii="Calibri" w:hAnsi="Calibri"/>
+          <w:b/>
+        </w:rPr>
+        <w:t xml:space="preserve">Descripcion: </w:t>
+      </w:r>
+      <w:r>
+        <w:rPr>
+          <w:rFonts w:ascii="Calibri" w:hAnsi="Calibri"/>
+        </w:rPr>
+        <w:t>Se implemento una funcion que permite activar o desactivar rojo, verde y azul. Para dejar evidencia ejecutable en notebook se guardo una simulacion de los estados principales.</w:t>
+      </w:r>
+    </w:p>
+    <w:p>
+      <w:pPr>
+        <w:spacing w:before="0" w:after="120" w:line="300" w:lineRule="auto"/>
+      </w:pPr>
+      <w:r>
+        <w:rPr>
+          <w:rFonts w:ascii="Calibri" w:hAnsi="Calibri"/>
+          <w:b/>
+        </w:rPr>
+        <w:t xml:space="preserve">Funcion o aprendizaje relevante: </w:t>
+      </w:r>
+      <w:r>
+        <w:rPr>
+          <w:rFonts w:ascii="Calibri" w:hAnsi="Calibri"/>
+        </w:rPr>
+        <w:t>La aplicacion interactiva usa `cv2.imshow` y `cv2.waitKey`; en ejecucion automatica se evita abrir ventanas bloqueantes.</w:t>
+      </w:r>
+    </w:p>
+    <w:p>
+      <w:pPr>
+        <w:spacing w:before="0" w:after="120" w:line="300" w:lineRule="auto"/>
+      </w:pPr>
+      <w:r>
+        <w:rPr>
+          <w:rFonts w:ascii="Calibri" w:hAnsi="Calibri"/>
+        </w:rPr>
+        <w:t>Fragmento de codigo principal:</w:t>
+      </w:r>
+    </w:p>
+    <w:tbl>
+      <w:tblPr>
+        <w:tblW w:type="auto" w:w="0"/>
+        <w:jc w:val="center"/>
+        <w:tblLook w:firstColumn="1" w:firstRow="1" w:lastColumn="0" w:lastRow="0" w:noHBand="0" w:noVBand="1" w:val="04A0"/>
+      </w:tblPr>
+      <w:tblGrid>
+        <w:gridCol w:w="9026"/>
+      </w:tblGrid>
+      <w:tr>
+        <w:tc>
+          <w:tcPr>
+            <w:tcW w:type="dxa" w:w="9026"/>
+            <w:shd w:fill="F2F4F7"/>
+            <w:tcMar>
+              <w:top w:w="80" w:type="dxa"/>
+              <w:start w:w="120" w:type="dxa"/>
+              <w:bottom w:w="80" w:type="dxa"/>
+              <w:end w:w="120" w:type="dxa"/>
+            </w:tcMar>
+            <w:vAlign w:val="center"/>
+          </w:tcPr>
+          <w:p>
+            <w:pPr>
+              <w:spacing w:before="0" w:after="0"/>
+            </w:pPr>
+            <w:r>
+              <w:rPr>
+                <w:rFonts w:ascii="Calibri" w:hAnsi="Calibri"/>
+                <w:color w:val="1F2937"/>
+                <w:sz w:val="20"/>
+              </w:rPr>
+              <w:t>def filter_channels(image_bgr, show_red=True, show_green=True, show_blue=True):</w:t>
+            </w:r>
+            <w:r>
+              <w:br/>
+            </w:r>
+            <w:r>
+              <w:rPr>
+                <w:rFonts w:ascii="Calibri" w:hAnsi="Calibri"/>
+                <w:color w:val="1F2937"/>
+                <w:sz w:val="20"/>
+              </w:rPr>
+              <w:t xml:space="preserve">    filtered = image_bgr.copy()</w:t>
+            </w:r>
+            <w:r>
+              <w:br/>
+            </w:r>
+            <w:r>
+              <w:rPr>
+                <w:rFonts w:ascii="Calibri" w:hAnsi="Calibri"/>
+                <w:color w:val="1F2937"/>
+                <w:sz w:val="20"/>
+              </w:rPr>
+              <w:t xml:space="preserve">    if not show_blue: filtered[:, :, 0] = 0</w:t>
+            </w:r>
+            <w:r>
+              <w:br/>
+            </w:r>
+            <w:r>
+              <w:rPr>
+                <w:rFonts w:ascii="Calibri" w:hAnsi="Calibri"/>
+                <w:color w:val="1F2937"/>
+                <w:sz w:val="20"/>
+              </w:rPr>
+              <w:t xml:space="preserve">    if not show_green: filtered[:, :, 1] = 0</w:t>
+            </w:r>
+            <w:r>
+              <w:br/>
+            </w:r>
+            <w:r>
+              <w:rPr>
+                <w:rFonts w:ascii="Calibri" w:hAnsi="Calibri"/>
+                <w:color w:val="1F2937"/>
+                <w:sz w:val="20"/>
+              </w:rPr>
+              <w:t xml:space="preserve">    if not show_red: filtered[:, :, 2] = 0</w:t>
+            </w:r>
+            <w:r>
+              <w:br/>
+            </w:r>
+            <w:r>
+              <w:rPr>
+                <w:rFonts w:ascii="Calibri" w:hAnsi="Calibri"/>
+                <w:color w:val="1F2937"/>
+                <w:sz w:val="20"/>
+              </w:rPr>
+              <w:t xml:space="preserve">    return filtered</w:t>
+            </w:r>
+            <w:r>
+              <w:br/>
+            </w:r>
+            <w:r>
+              <w:rPr>
+                <w:rFonts w:ascii="Calibri" w:hAnsi="Calibri"/>
+                <w:color w:val="1F2937"/>
+                <w:sz w:val="20"/>
+              </w:rPr>
+              <w:t># En la version interactiva, cv2.waitKey alterna r/g/b y q cierra.</w:t>
+            </w:r>
+          </w:p>
+        </w:tc>
+      </w:tr>
+    </w:tbl>
+    <w:p>
+      <w:pPr>
+        <w:spacing w:before="0" w:after="40" w:line="240" w:lineRule="auto"/>
+        <w:jc w:val="center"/>
+      </w:pPr>
+      <w:r>
+        <w:drawing>
+          <wp:inline>
+            <wp:extent cx="5715000" cy="3049959"/>
+            <wp:docPr id="5" name="Picture 5"/>
+            <wp:cNvGraphicFramePr>
+              <a:graphicFrameLocks noChangeAspect="1"/>
+            </wp:cNvGraphicFramePr>
+            <a:graphic>
+              <a:graphicData uri="http://schemas.openxmlformats.org/drawingml/2006/picture">
+                <pic:pic>
+                  <pic:nvPicPr>
+                    <pic:cNvPr id="0" name="04_visor_canales_simulado.png"/>
+                    <pic:cNvPicPr/>
+                  </pic:nvPicPr>
+                  <pic:blipFill>
+                    <a:blip r:embed="rId13"/>
+                    <a:stretch>
+                      <a:fillRect/>
+                    </a:stretch>
+                  </pic:blipFill>
+                  <pic:spPr>
+                    <a:xfrm>
+                      <a:off x="0" y="0"/>
+                      <a:ext cx="5715000" cy="3049959"/>
+                    </a:xfrm>
+                    <a:prstGeom prst="rect"/>
+                  </pic:spPr>
+                </pic:pic>
+              </a:graphicData>
+            </a:graphic>
+          </wp:inline>
+        </w:drawing>
+      </w:r>
+    </w:p>
+    <w:p>
+      <w:pPr>
+        <w:spacing w:before="0" w:after="200" w:line="240" w:lineRule="auto"/>
+        <w:jc w:val="center"/>
+      </w:pPr>
+      <w:r>
+        <w:rPr>
+          <w:rFonts w:ascii="Calibri" w:hAnsi="Calibri"/>
+          <w:i/>
+          <w:color w:val="555555"/>
+          <w:sz w:val="18"/>
+        </w:rPr>
+        <w:t>Captura - 4. Aplicacion interactiva de visualizacion de canales</w:t>
+      </w:r>
+    </w:p>
+    <w:p>
+      <w:pPr>
+        <w:pStyle w:val="Heading2"/>
+        <w:spacing w:before="280" w:after="140" w:line="300" w:lineRule="auto"/>
+      </w:pPr>
+      <w:r>
+        <w:rPr>
+          <w:rFonts w:ascii="Calibri" w:hAnsi="Calibri"/>
+          <w:b/>
+          <w:color w:val="2E74B5"/>
+          <w:sz w:val="26"/>
+        </w:rPr>
+        <w:t>5. Dibujo de figuras y texto en imagenes</w:t>
+      </w:r>
+    </w:p>
+    <w:p>
+      <w:pPr>
+        <w:spacing w:before="0" w:after="120" w:line="300" w:lineRule="auto"/>
+      </w:pPr>
+      <w:r>
+        <w:rPr>
+          <w:rFonts w:ascii="Calibri" w:hAnsi="Calibri"/>
+          <w:b/>
+        </w:rPr>
+        <w:t xml:space="preserve">Descripcion: </w:t>
+      </w:r>
+      <w:r>
+        <w:rPr>
+          <w:rFonts w:ascii="Calibri" w:hAnsi="Calibri"/>
+        </w:rPr>
+        <w:t>Se abrio la imagen de la persona, se marco el rostro con un circulo y se agrego texto descriptivo antes de guardar la salida.</w:t>
+      </w:r>
+    </w:p>
+    <w:p>
+      <w:pPr>
+        <w:spacing w:before="0" w:after="120" w:line="300" w:lineRule="auto"/>
+      </w:pPr>
+      <w:r>
+        <w:rPr>
+          <w:rFonts w:ascii="Calibri" w:hAnsi="Calibri"/>
+          <w:b/>
+        </w:rPr>
+        <w:t xml:space="preserve">Funcion o aprendizaje relevante: </w:t>
+      </w:r>
+      <w:r>
+        <w:rPr>
+          <w:rFonts w:ascii="Calibri" w:hAnsi="Calibri"/>
+        </w:rPr>
+        <w:t>Las primitivas `cv2.circle` y `cv2.putText` permiten anotar imagenes directamente sobre la matriz de pixeles.</w:t>
+      </w:r>
+    </w:p>
+    <w:p>
+      <w:pPr>
+        <w:spacing w:before="0" w:after="120" w:line="300" w:lineRule="auto"/>
+      </w:pPr>
+      <w:r>
+        <w:rPr>
+          <w:rFonts w:ascii="Calibri" w:hAnsi="Calibri"/>
+        </w:rPr>
+        <w:t>Fragmento de codigo principal:</w:t>
+      </w:r>
+    </w:p>
+    <w:tbl>
+      <w:tblPr>
+        <w:tblW w:type="auto" w:w="0"/>
+        <w:jc w:val="center"/>
+        <w:tblLook w:firstColumn="1" w:firstRow="1" w:lastColumn="0" w:lastRow="0" w:noHBand="0" w:noVBand="1" w:val="04A0"/>
+      </w:tblPr>
+      <w:tblGrid>
+        <w:gridCol w:w="9026"/>
+      </w:tblGrid>
+      <w:tr>
+        <w:tc>
+          <w:tcPr>
+            <w:tcW w:type="dxa" w:w="9026"/>
+            <w:shd w:fill="F2F4F7"/>
+            <w:tcMar>
+              <w:top w:w="80" w:type="dxa"/>
+              <w:start w:w="120" w:type="dxa"/>
+              <w:bottom w:w="80" w:type="dxa"/>
+              <w:end w:w="120" w:type="dxa"/>
+            </w:tcMar>
+            <w:vAlign w:val="center"/>
+          </w:tcPr>
+          <w:p>
+            <w:pPr>
+              <w:spacing w:before="0" w:after="0"/>
+            </w:pPr>
+            <w:r>
+              <w:rPr>
+                <w:rFonts w:ascii="Calibri" w:hAnsi="Calibri"/>
+                <w:color w:val="1F2937"/>
+                <w:sz w:val="20"/>
+              </w:rPr>
+              <w:t>annotated = loaded["persona"].copy()</w:t>
+            </w:r>
+            <w:r>
+              <w:br/>
+            </w:r>
+            <w:r>
+              <w:rPr>
+                <w:rFonts w:ascii="Calibri" w:hAnsi="Calibri"/>
+                <w:color w:val="1F2937"/>
+                <w:sz w:val="20"/>
+              </w:rPr>
+              <w:t>cv2.circle(annotated, face_center, 95, (0, 255, 255), 6, cv2.LINE_AA)</w:t>
+            </w:r>
+            <w:r>
+              <w:br/>
+            </w:r>
+            <w:r>
+              <w:rPr>
+                <w:rFonts w:ascii="Calibri" w:hAnsi="Calibri"/>
+                <w:color w:val="1F2937"/>
+                <w:sz w:val="20"/>
+              </w:rPr>
+              <w:t>cv2.putText(annotated, "Persona", (268, 58), cv2.FONT_HERSHEY_SIMPLEX, 1.15, (20, 20, 220), 3)</w:t>
+            </w:r>
+            <w:r>
+              <w:br/>
+            </w:r>
+            <w:r>
+              <w:rPr>
+                <w:rFonts w:ascii="Calibri" w:hAnsi="Calibri"/>
+                <w:color w:val="1F2937"/>
+                <w:sz w:val="20"/>
+              </w:rPr>
+              <w:t>cv2.imwrite(str(RESULTS_DIR / "05_persona_anotada.png"), annotated)</w:t>
+            </w:r>
+          </w:p>
+        </w:tc>
+      </w:tr>
+    </w:tbl>
+    <w:p>
+      <w:pPr>
+        <w:spacing w:before="0" w:after="40" w:line="240" w:lineRule="auto"/>
+        <w:jc w:val="center"/>
+      </w:pPr>
+      <w:r>
+        <w:drawing>
+          <wp:inline>
+            <wp:extent cx="5715000" cy="2200189"/>
+            <wp:docPr id="6" name="Picture 6"/>
+            <wp:cNvGraphicFramePr>
+              <a:graphicFrameLocks noChangeAspect="1"/>
+            </wp:cNvGraphicFramePr>
+            <a:graphic>
+              <a:graphicData uri="http://schemas.openxmlformats.org/drawingml/2006/picture">
+                <pic:pic>
+                  <pic:nvPicPr>
+                    <pic:cNvPr id="0" name="05_figuras_y_texto.png"/>
+                    <pic:cNvPicPr/>
+                  </pic:nvPicPr>
+                  <pic:blipFill>
+                    <a:blip r:embed="rId14"/>
+                    <a:stretch>
+                      <a:fillRect/>
+                    </a:stretch>
+                  </pic:blipFill>
+                  <pic:spPr>
+                    <a:xfrm>
+                      <a:off x="0" y="0"/>
+                      <a:ext cx="5715000" cy="2200189"/>
+                    </a:xfrm>
+                    <a:prstGeom prst="rect"/>
+                  </pic:spPr>
+                </pic:pic>
+              </a:graphicData>
+            </a:graphic>
+          </wp:inline>
+        </w:drawing>
+      </w:r>
+    </w:p>
+    <w:p>
+      <w:pPr>
+        <w:spacing w:before="0" w:after="200" w:line="240" w:lineRule="auto"/>
+        <w:jc w:val="center"/>
+      </w:pPr>
+      <w:r>
+        <w:rPr>
+          <w:rFonts w:ascii="Calibri" w:hAnsi="Calibri"/>
+          <w:i/>
+          <w:color w:val="555555"/>
+          <w:sz w:val="18"/>
+        </w:rPr>
+        <w:t>Captura - 5. Dibujo de figuras y texto en imagenes</w:t>
+      </w:r>
+    </w:p>
+    <w:p>
+      <w:pPr>
+        <w:pStyle w:val="Heading2"/>
+        <w:spacing w:before="280" w:after="140" w:line="300" w:lineRule="auto"/>
+      </w:pPr>
+      <w:r>
+        <w:rPr>
+          <w:rFonts w:ascii="Calibri" w:hAnsi="Calibri"/>
+          <w:b/>
+          <w:color w:val="2E74B5"/>
+          <w:sz w:val="26"/>
+        </w:rPr>
+        <w:t>6. Aplicacion de umbral binario</w:t>
+      </w:r>
+    </w:p>
+    <w:p>
+      <w:pPr>
+        <w:spacing w:before="0" w:after="120" w:line="300" w:lineRule="auto"/>
+      </w:pPr>
+      <w:r>
+        <w:rPr>
+          <w:rFonts w:ascii="Calibri" w:hAnsi="Calibri"/>
+          <w:b/>
+        </w:rPr>
+        <w:t xml:space="preserve">Descripcion: </w:t>
+      </w:r>
+      <w:r>
+        <w:rPr>
+          <w:rFonts w:ascii="Calibri" w:hAnsi="Calibri"/>
+        </w:rPr>
+        <w:t>La imagen combinada se transformo a grises y se aplicaron dos umbrales: uno fijo en 127 y otro automatico con Otsu. Ambos resultados separan pixeles claros y oscuros.</w:t>
+      </w:r>
+    </w:p>
+    <w:p>
+      <w:pPr>
+        <w:spacing w:before="0" w:after="120" w:line="300" w:lineRule="auto"/>
+      </w:pPr>
+      <w:r>
+        <w:rPr>
+          <w:rFonts w:ascii="Calibri" w:hAnsi="Calibri"/>
+          <w:b/>
+        </w:rPr>
+        <w:t xml:space="preserve">Funcion o aprendizaje relevante: </w:t>
+      </w:r>
+      <w:r>
+        <w:rPr>
+          <w:rFonts w:ascii="Calibri" w:hAnsi="Calibri"/>
+        </w:rPr>
+        <w:t>`cv2.threshold` devuelve el umbral usado y la imagen binaria. Otsu es util cuando se desea calcular el umbral desde el histograma.</w:t>
+      </w:r>
+    </w:p>
+    <w:p>
+      <w:pPr>
+        <w:spacing w:before="0" w:after="120" w:line="300" w:lineRule="auto"/>
+      </w:pPr>
+      <w:r>
+        <w:rPr>
+          <w:rFonts w:ascii="Calibri" w:hAnsi="Calibri"/>
+        </w:rPr>
+        <w:t>Fragmento de codigo principal:</w:t>
+      </w:r>
+    </w:p>
+    <w:tbl>
+      <w:tblPr>
+        <w:tblW w:type="auto" w:w="0"/>
+        <w:jc w:val="center"/>
+        <w:tblLook w:firstColumn="1" w:firstRow="1" w:lastColumn="0" w:lastRow="0" w:noHBand="0" w:noVBand="1" w:val="04A0"/>
+      </w:tblPr>
+      <w:tblGrid>
+        <w:gridCol w:w="9026"/>
+      </w:tblGrid>
+      <w:tr>
+        <w:tc>
+          <w:tcPr>
+            <w:tcW w:type="dxa" w:w="9026"/>
+            <w:shd w:fill="F2F4F7"/>
+            <w:tcMar>
+              <w:top w:w="80" w:type="dxa"/>
+              <w:start w:w="120" w:type="dxa"/>
+              <w:bottom w:w="80" w:type="dxa"/>
+              <w:end w:w="120" w:type="dxa"/>
+            </w:tcMar>
+            <w:vAlign w:val="center"/>
+          </w:tcPr>
+          <w:p>
+            <w:pPr>
+              <w:spacing w:before="0" w:after="0"/>
+            </w:pPr>
+            <w:r>
+              <w:rPr>
+                <w:rFonts w:ascii="Calibri" w:hAnsi="Calibri"/>
+                <w:color w:val="1F2937"/>
+                <w:sz w:val="20"/>
+              </w:rPr>
+              <w:t>gray_for_threshold = cv2.cvtColor(combined, cv2.COLOR_BGR2GRAY)</w:t>
+            </w:r>
+            <w:r>
+              <w:br/>
+            </w:r>
+            <w:r>
+              <w:rPr>
+                <w:rFonts w:ascii="Calibri" w:hAnsi="Calibri"/>
+                <w:color w:val="1F2937"/>
+                <w:sz w:val="20"/>
+              </w:rPr>
+              <w:t>_, binary_fixed = cv2.threshold(gray_for_threshold, 127, 255, cv2.THRESH_BINARY)</w:t>
+            </w:r>
+            <w:r>
+              <w:br/>
+            </w:r>
+            <w:r>
+              <w:rPr>
+                <w:rFonts w:ascii="Calibri" w:hAnsi="Calibri"/>
+                <w:color w:val="1F2937"/>
+                <w:sz w:val="20"/>
+              </w:rPr>
+              <w:t>otsu_value, binary_otsu = cv2.threshold(gray_for_threshold, 0, 255, cv2.THRESH_BINARY + cv2.THRESH_OTSU)</w:t>
+            </w:r>
+          </w:p>
+        </w:tc>
+      </w:tr>
+    </w:tbl>
+    <w:p>
+      <w:pPr>
+        <w:spacing w:before="0" w:after="40" w:line="240" w:lineRule="auto"/>
+        <w:jc w:val="center"/>
+      </w:pPr>
+      <w:r>
+        <w:drawing>
+          <wp:inline>
+            <wp:extent cx="5715000" cy="1495596"/>
+            <wp:docPr id="7" name="Picture 7"/>
+            <wp:cNvGraphicFramePr>
+              <a:graphicFrameLocks noChangeAspect="1"/>
+            </wp:cNvGraphicFramePr>
+            <a:graphic>
+              <a:graphicData uri="http://schemas.openxmlformats.org/drawingml/2006/picture">
+                <pic:pic>
+                  <pic:nvPicPr>
+                    <pic:cNvPr id="0" name="06_threshold_binario.png"/>
+                    <pic:cNvPicPr/>
+                  </pic:nvPicPr>
+                  <pic:blipFill>
+                    <a:blip r:embed="rId15"/>
+                    <a:stretch>
+                      <a:fillRect/>
+                    </a:stretch>
+                  </pic:blipFill>
+                  <pic:spPr>
+                    <a:xfrm>
+                      <a:off x="0" y="0"/>
+                      <a:ext cx="5715000" cy="1495596"/>
+                    </a:xfrm>
+                    <a:prstGeom prst="rect"/>
+                  </pic:spPr>
+                </pic:pic>
+              </a:graphicData>
+            </a:graphic>
+          </wp:inline>
+        </w:drawing>
+      </w:r>
+    </w:p>
+    <w:p>
+      <w:pPr>
+        <w:spacing w:before="0" w:after="200" w:line="240" w:lineRule="auto"/>
+        <w:jc w:val="center"/>
+      </w:pPr>
+      <w:r>
+        <w:rPr>
+          <w:rFonts w:ascii="Calibri" w:hAnsi="Calibri"/>
+          <w:i/>
+          <w:color w:val="555555"/>
+          <w:sz w:val="18"/>
+        </w:rPr>
+        <w:t>Captura - 6. Aplicacion de umbral binario</w:t>
+      </w:r>
+    </w:p>
+    <w:p>
+      <w:pPr>
+        <w:pStyle w:val="Heading2"/>
+        <w:spacing w:before="280" w:after="140" w:line="300" w:lineRule="auto"/>
+      </w:pPr>
+      <w:r>
+        <w:rPr>
+          <w:rFonts w:ascii="Calibri" w:hAnsi="Calibri"/>
+          <w:b/>
+          <w:color w:val="2E74B5"/>
+          <w:sz w:val="26"/>
+        </w:rPr>
+        <w:t>7. Programa de dibujo interactivo con mouse y teclado</w:t>
+      </w:r>
+    </w:p>
+    <w:p>
+      <w:pPr>
+        <w:spacing w:before="0" w:after="120" w:line="300" w:lineRule="auto"/>
+      </w:pPr>
+      <w:r>
+        <w:rPr>
+          <w:rFonts w:ascii="Calibri" w:hAnsi="Calibri"/>
+          <w:b/>
+        </w:rPr>
+        <w:t xml:space="preserve">Descripcion: </w:t>
+      </w:r>
+      <w:r>
+        <w:rPr>
+          <w:rFonts w:ascii="Calibri" w:hAnsi="Calibri"/>
+        </w:rPr>
+        <w:t>Se implemento una clase `DrawingApp` con eventos de mouse para dibujar figuras y teclado para elegir modo, deshacer y guardar. El notebook incluye una captura simulada del resultado final.</w:t>
+      </w:r>
+    </w:p>
+    <w:p>
+      <w:pPr>
+        <w:spacing w:before="0" w:after="120" w:line="300" w:lineRule="auto"/>
+      </w:pPr>
+      <w:r>
+        <w:rPr>
+          <w:rFonts w:ascii="Calibri" w:hAnsi="Calibri"/>
+          <w:b/>
+        </w:rPr>
+        <w:t xml:space="preserve">Funcion o aprendizaje relevante: </w:t>
+      </w:r>
+      <w:r>
+        <w:rPr>
+          <w:rFonts w:ascii="Calibri" w:hAnsi="Calibri"/>
+        </w:rPr>
+        <w:t>`cv2.setMouseCallback` conecta eventos del mouse con funciones Python; mantener un historial de copias del lienzo permite implementar deshacer.</w:t>
+      </w:r>
+    </w:p>
+    <w:p>
+      <w:pPr>
+        <w:spacing w:before="0" w:after="120" w:line="300" w:lineRule="auto"/>
+      </w:pPr>
+      <w:r>
+        <w:rPr>
+          <w:rFonts w:ascii="Calibri" w:hAnsi="Calibri"/>
+        </w:rPr>
+        <w:t>Fragmento de codigo principal:</w:t>
+      </w:r>
+    </w:p>
+    <w:tbl>
+      <w:tblPr>
+        <w:tblW w:type="auto" w:w="0"/>
+        <w:jc w:val="center"/>
+        <w:tblLook w:firstColumn="1" w:firstRow="1" w:lastColumn="0" w:lastRow="0" w:noHBand="0" w:noVBand="1" w:val="04A0"/>
+      </w:tblPr>
+      <w:tblGrid>
+        <w:gridCol w:w="9026"/>
+      </w:tblGrid>
+      <w:tr>
+        <w:tc>
+          <w:tcPr>
+            <w:tcW w:type="dxa" w:w="9026"/>
+            <w:shd w:fill="F2F4F7"/>
+            <w:tcMar>
+              <w:top w:w="80" w:type="dxa"/>
+              <w:start w:w="120" w:type="dxa"/>
+              <w:bottom w:w="80" w:type="dxa"/>
+              <w:end w:w="120" w:type="dxa"/>
+            </w:tcMar>
+            <w:vAlign w:val="center"/>
+          </w:tcPr>
+          <w:p>
+            <w:pPr>
+              <w:spacing w:before="0" w:after="0"/>
+            </w:pPr>
+            <w:r>
+              <w:rPr>
+                <w:rFonts w:ascii="Calibri" w:hAnsi="Calibri"/>
+                <w:color w:val="1F2937"/>
+                <w:sz w:val="20"/>
+              </w:rPr>
+              <w:t>cv2.namedWindow(window, cv2.WINDOW_NORMAL)</w:t>
+            </w:r>
+            <w:r>
+              <w:br/>
+            </w:r>
+            <w:r>
+              <w:rPr>
+                <w:rFonts w:ascii="Calibri" w:hAnsi="Calibri"/>
+                <w:color w:val="1F2937"/>
+                <w:sz w:val="20"/>
+              </w:rPr>
+              <w:t>cv2.setMouseCallback(window, self.on_mouse)</w:t>
+            </w:r>
+            <w:r>
+              <w:br/>
+            </w:r>
+            <w:r>
+              <w:rPr>
+                <w:rFonts w:ascii="Calibri" w:hAnsi="Calibri"/>
+                <w:color w:val="1F2937"/>
+                <w:sz w:val="20"/>
+              </w:rPr>
+              <w:t># Teclas: r rectangulo, c circulo, l linea, u deshacer, s guardar, q salir.</w:t>
+            </w:r>
+            <w:r>
+              <w:br/>
+            </w:r>
+            <w:r>
+              <w:rPr>
+                <w:rFonts w:ascii="Calibri" w:hAnsi="Calibri"/>
+                <w:color w:val="1F2937"/>
+                <w:sz w:val="20"/>
+              </w:rPr>
+              <w:t>cv2.imwrite(str(self.save_path), self.canvas)</w:t>
+            </w:r>
+          </w:p>
+        </w:tc>
+      </w:tr>
+    </w:tbl>
+    <w:p>
+      <w:pPr>
+        <w:spacing w:before="0" w:after="40" w:line="240" w:lineRule="auto"/>
+        <w:jc w:val="center"/>
+      </w:pPr>
+      <w:r>
+        <w:drawing>
+          <wp:inline>
+            <wp:extent cx="5715000" cy="4099891"/>
+            <wp:docPr id="8" name="Picture 8"/>
+            <wp:cNvGraphicFramePr>
+              <a:graphicFrameLocks noChangeAspect="1"/>
+            </wp:cNvGraphicFramePr>
+            <a:graphic>
+              <a:graphicData uri="http://schemas.openxmlformats.org/drawingml/2006/picture">
+                <pic:pic>
+                  <pic:nvPicPr>
+                    <pic:cNvPr id="0" name="07_dibujo_interactivo.png"/>
+                    <pic:cNvPicPr/>
+                  </pic:nvPicPr>
+                  <pic:blipFill>
+                    <a:blip r:embed="rId16"/>
+                    <a:stretch>
+                      <a:fillRect/>
+                    </a:stretch>
+                  </pic:blipFill>
+                  <pic:spPr>
+                    <a:xfrm>
+                      <a:off x="0" y="0"/>
+                      <a:ext cx="5715000" cy="4099891"/>
+                    </a:xfrm>
+                    <a:prstGeom prst="rect"/>
+                  </pic:spPr>
+                </pic:pic>
+              </a:graphicData>
+            </a:graphic>
+          </wp:inline>
+        </w:drawing>
+      </w:r>
+    </w:p>
+    <w:p>
+      <w:pPr>
+        <w:spacing w:before="0" w:after="200" w:line="240" w:lineRule="auto"/>
+        <w:jc w:val="center"/>
+      </w:pPr>
+      <w:r>
+        <w:rPr>
+          <w:rFonts w:ascii="Calibri" w:hAnsi="Calibri"/>
+          <w:i/>
+          <w:color w:val="555555"/>
+          <w:sz w:val="18"/>
+        </w:rPr>
+        <w:t>Captura - 7. Programa de dibujo interactivo con mouse y teclado</w:t>
+      </w:r>
+    </w:p>
+    <w:p>
+      <w:pPr>
+        <w:pStyle w:val="Heading1"/>
+        <w:spacing w:before="360" w:after="200" w:line="300" w:lineRule="auto"/>
+      </w:pPr>
+      <w:r>
+        <w:rPr>
+          <w:rFonts w:ascii="Calibri" w:hAnsi="Calibri"/>
+          <w:b/>
+          <w:color w:val="2E74B5"/>
+          <w:sz w:val="32"/>
+        </w:rPr>
+        <w:t>Avances individuales del proyecto grupal</w:t>
+      </w:r>
+    </w:p>
+    <w:p>
+      <w:pPr>
+        <w:numPr>
+          <w:ilvl w:val="0"/>
+          <w:numId w:val="4"/>
+        </w:numPr>
+        <w:spacing w:before="0" w:after="80" w:line="300" w:lineRule="auto"/>
+      </w:pPr>
+      <w:r>
+        <w:rPr>
+          <w:rFonts w:ascii="Calibri" w:hAnsi="Calibri"/>
+        </w:rPr>
+        <w:t>Preparacion del entorno Conda, kernel de Jupyter y ejecucion reproducible del notebook.</w:t>
+      </w:r>
+    </w:p>
+    <w:p>
+      <w:pPr>
+        <w:numPr>
+          <w:ilvl w:val="0"/>
+          <w:numId w:val="4"/>
+        </w:numPr>
+        <w:spacing w:before="0" w:after="80" w:line="300" w:lineRule="auto"/>
+      </w:pPr>
+      <w:r>
+        <w:rPr>
+          <w:rFonts w:ascii="Calibri" w:hAnsi="Calibri"/>
+        </w:rPr>
+        <w:t>Prototipo de carga y generacion de imagenes base para pruebas de procesamiento.</w:t>
+      </w:r>
+    </w:p>
+    <w:p>
+      <w:pPr>
+        <w:numPr>
+          <w:ilvl w:val="0"/>
+          <w:numId w:val="4"/>
+        </w:numPr>
+        <w:spacing w:before="0" w:after="80" w:line="300" w:lineRule="auto"/>
+      </w:pPr>
+      <w:r>
+        <w:rPr>
+          <w:rFonts w:ascii="Calibri" w:hAnsi="Calibri"/>
+        </w:rPr>
+        <w:t>Implementacion de redimensionamiento con relacion de aspecto y bordes negros.</w:t>
+      </w:r>
+    </w:p>
+    <w:p>
+      <w:pPr>
+        <w:numPr>
+          <w:ilvl w:val="0"/>
+          <w:numId w:val="4"/>
+        </w:numPr>
+        <w:spacing w:before="0" w:after="80" w:line="300" w:lineRule="auto"/>
+      </w:pPr>
+      <w:r>
+        <w:rPr>
+          <w:rFonts w:ascii="Calibri" w:hAnsi="Calibri"/>
+        </w:rPr>
+        <w:t>Prueba de operaciones de canales, negativo, escala de grises y threshold binario.</w:t>
+      </w:r>
+    </w:p>
+    <w:p>
+      <w:pPr>
+        <w:numPr>
+          <w:ilvl w:val="0"/>
+          <w:numId w:val="4"/>
+        </w:numPr>
+        <w:spacing w:before="0" w:after="80" w:line="300" w:lineRule="auto"/>
+      </w:pPr>
+      <w:r>
+        <w:rPr>
+          <w:rFonts w:ascii="Calibri" w:hAnsi="Calibri"/>
+        </w:rPr>
+        <w:t>Prototipo de interaccion por teclado y mouse para visualizacion de canales y dibujo de figuras.</w:t>
+      </w:r>
+    </w:p>
+    <w:p>
+      <w:pPr>
+        <w:pStyle w:val="Heading1"/>
+        <w:spacing w:before="360" w:after="200" w:line="300" w:lineRule="auto"/>
+      </w:pPr>
+      <w:r>
+        <w:rPr>
+          <w:rFonts w:ascii="Calibri" w:hAnsi="Calibri"/>
+          <w:b/>
+          <w:color w:val="2E74B5"/>
+          <w:sz w:val="32"/>
+        </w:rPr>
+        <w:t>Cuestionario</w:t>
+      </w:r>
+    </w:p>
+    <w:p>
+      <w:pPr>
+        <w:pStyle w:val="Heading2"/>
+        <w:spacing w:before="280" w:after="140" w:line="300" w:lineRule="auto"/>
+      </w:pPr>
+      <w:r>
+        <w:rPr>
+          <w:rFonts w:ascii="Calibri" w:hAnsi="Calibri"/>
+          <w:b/>
+          <w:color w:val="2E74B5"/>
+          <w:sz w:val="26"/>
+        </w:rPr>
+        <w:t>1. Que otros modelos de colores existen para las imagenes?</w:t>
+      </w:r>
+    </w:p>
+    <w:p>
+      <w:pPr>
+        <w:spacing w:before="0" w:after="120" w:line="300" w:lineRule="auto"/>
+      </w:pPr>
+      <w:r>
+        <w:rPr>
+          <w:rFonts w:ascii="Calibri" w:hAnsi="Calibri"/>
+        </w:rPr>
+        <w:t>Ademas de RGB/BGR existen HSV, HSL, CMYK, YCrCb/YCbCr, LAB, XYZ y escala de grises. HSV es util para segmentar colores por tono; LAB separa luminosidad de cromaticidad; CMYK se usa en impresion; YCrCb se utiliza en compresion y video.</w:t>
+      </w:r>
+    </w:p>
+    <w:p>
+      <w:pPr>
+        <w:pStyle w:val="Heading2"/>
+        <w:spacing w:before="280" w:after="140" w:line="300" w:lineRule="auto"/>
+      </w:pPr>
+      <w:r>
+        <w:rPr>
+          <w:rFonts w:ascii="Calibri" w:hAnsi="Calibri"/>
+          <w:b/>
+          <w:color w:val="2E74B5"/>
+          <w:sz w:val="26"/>
+        </w:rPr>
+        <w:t>2. Que otros cambios se pueden realizar a las imagenes con OpenCV?</w:t>
+      </w:r>
+    </w:p>
+    <w:p>
+      <w:pPr>
+        <w:spacing w:before="0" w:after="120" w:line="300" w:lineRule="auto"/>
+      </w:pPr>
+      <w:r>
+        <w:rPr>
+          <w:rFonts w:ascii="Calibri" w:hAnsi="Calibri"/>
+        </w:rPr>
+        <w:t>OpenCV permite rotaciones, recortes, traslaciones, filtros de suavizado, deteccion de bordes, ecualizacion de histograma, operaciones morfologicas, deteccion de contornos, mezclas, transformaciones geometricas, segmentacion y correccion de color.</w:t>
+      </w:r>
+    </w:p>
+    <w:p>
+      <w:pPr>
+        <w:pStyle w:val="Heading2"/>
+        <w:spacing w:before="280" w:after="140" w:line="300" w:lineRule="auto"/>
+      </w:pPr>
+      <w:r>
+        <w:rPr>
+          <w:rFonts w:ascii="Calibri" w:hAnsi="Calibri"/>
+          <w:b/>
+          <w:color w:val="2E74B5"/>
+          <w:sz w:val="26"/>
+        </w:rPr>
+        <w:t>3. Cual seria el uso del binary threshold en el procesamiento de imagenes?</w:t>
+      </w:r>
+    </w:p>
+    <w:p>
+      <w:pPr>
+        <w:spacing w:before="0" w:after="120" w:line="300" w:lineRule="auto"/>
+      </w:pPr>
+      <w:r>
+        <w:rPr>
+          <w:rFonts w:ascii="Calibri" w:hAnsi="Calibri"/>
+        </w:rPr>
+        <w:t>El umbral binario permite separar regiones de interes del fondo cuando existe diferencia de intensidad. Se usa en segmentacion, lectura de documentos, deteccion de siluetas, generacion de mascaras, conteo de objetos y preprocesamiento antes de buscar contornos.</w:t>
+      </w:r>
+    </w:p>
+    <w:p>
+      <w:pPr>
+        <w:pStyle w:val="Heading1"/>
+        <w:spacing w:before="360" w:after="200" w:line="300" w:lineRule="auto"/>
+      </w:pPr>
+      <w:r>
+        <w:rPr>
+          <w:rFonts w:ascii="Calibri" w:hAnsi="Calibri"/>
+          <w:b/>
+          <w:color w:val="2E74B5"/>
+          <w:sz w:val="32"/>
+        </w:rPr>
+        <w:t>Conclusiones</w:t>
+      </w:r>
+    </w:p>
+    <w:p>
+      <w:pPr>
+        <w:numPr>
+          <w:ilvl w:val="0"/>
+          <w:numId w:val="4"/>
+        </w:numPr>
+        <w:spacing w:before="0" w:after="80" w:line="300" w:lineRule="auto"/>
+      </w:pPr>
+      <w:r>
+        <w:rPr>
+          <w:rFonts w:ascii="Calibri" w:hAnsi="Calibri"/>
+        </w:rPr>
+        <w:t>Se resolvieron todos los ejercicios propuestos de la guia en un notebook ejecutable y con salidas visibles.</w:t>
+      </w:r>
+    </w:p>
+    <w:p>
+      <w:pPr>
+        <w:numPr>
+          <w:ilvl w:val="0"/>
+          <w:numId w:val="4"/>
+        </w:numPr>
+        <w:spacing w:before="0" w:after="80" w:line="300" w:lineRule="auto"/>
+      </w:pPr>
+      <w:r>
+        <w:rPr>
+          <w:rFonts w:ascii="Calibri" w:hAnsi="Calibri"/>
+        </w:rPr>
+        <w:t>El redimensionamiento con letterbox conserva la relacion de aspecto y evita deformar las imagenes.</w:t>
+      </w:r>
+    </w:p>
+    <w:p>
+      <w:pPr>
+        <w:numPr>
+          <w:ilvl w:val="0"/>
+          <w:numId w:val="4"/>
+        </w:numPr>
+        <w:spacing w:before="0" w:after="80" w:line="300" w:lineRule="auto"/>
+      </w:pPr>
+      <w:r>
+        <w:rPr>
+          <w:rFonts w:ascii="Calibri" w:hAnsi="Calibri"/>
+        </w:rPr>
+        <w:t>La combinacion y separacion de canales exige recordar que OpenCV usa BGR, no RGB.</w:t>
+      </w:r>
+    </w:p>
+    <w:p>
+      <w:pPr>
+        <w:numPr>
+          <w:ilvl w:val="0"/>
+          <w:numId w:val="4"/>
+        </w:numPr>
+        <w:spacing w:before="0" w:after="80" w:line="300" w:lineRule="auto"/>
+      </w:pPr>
+      <w:r>
+        <w:rPr>
+          <w:rFonts w:ascii="Calibri" w:hAnsi="Calibri"/>
+        </w:rPr>
+        <w:t>Las funciones interactivas con `cv2.waitKey` y `cv2.setMouseCallback` quedaron implementadas y documentadas para ejecucion manual local.</w:t>
+      </w:r>
+    </w:p>
+    <w:p>
+      <w:pPr>
+        <w:numPr>
+          <w:ilvl w:val="0"/>
+          <w:numId w:val="4"/>
+        </w:numPr>
+        <w:spacing w:before="0" w:after="80" w:line="300" w:lineRule="auto"/>
+      </w:pPr>
+      <w:r>
+        <w:rPr>
+          <w:rFonts w:ascii="Calibri" w:hAnsi="Calibri"/>
+        </w:rPr>
+        <w:t>Las capturas generadas permiten verificar los resultados sin depender de ventanas interactivas durante la ejecucion automatica del notebook.</w:t>
+      </w:r>
+    </w:p>
+    <w:p>
+      <w:pPr>
+        <w:pStyle w:val="Heading1"/>
+        <w:spacing w:before="360" w:after="200" w:line="300" w:lineRule="auto"/>
+      </w:pPr>
+      <w:r>
+        <w:rPr>
+          <w:rFonts w:ascii="Calibri" w:hAnsi="Calibri"/>
+          <w:b/>
+          <w:color w:val="2E74B5"/>
+          <w:sz w:val="32"/>
+        </w:rPr>
+        <w:t>Referencias y bibliografia</w:t>
+      </w:r>
+    </w:p>
+    <w:p>
+      <w:pPr>
+        <w:numPr>
+          <w:ilvl w:val="0"/>
+          <w:numId w:val="4"/>
+        </w:numPr>
+        <w:spacing w:before="0" w:after="80" w:line="300" w:lineRule="auto"/>
+      </w:pPr>
+      <w:r>
+        <w:rPr>
+          <w:rFonts w:ascii="Calibri" w:hAnsi="Calibri"/>
+        </w:rPr>
+        <w:t>Gordon, V. S., &amp; Clevenger, J. L. (2020). Computer Graphics Programming in OpenGL with C++. Stylus Publishing, LLC.</w:t>
+      </w:r>
+    </w:p>
+    <w:p>
+      <w:pPr>
+        <w:numPr>
+          <w:ilvl w:val="0"/>
+          <w:numId w:val="4"/>
+        </w:numPr>
+        <w:spacing w:before="0" w:after="80" w:line="300" w:lineRule="auto"/>
+      </w:pPr>
+      <w:r>
+        <w:rPr>
+          <w:rFonts w:ascii="Calibri" w:hAnsi="Calibri"/>
+        </w:rPr>
+        <w:t>Kothari, D. P., Awari, G., Shrimankar, D., &amp; Bhende, A. (2019). Mathematics for Computer Graphics and Game Programming: A Self-Teaching Introduction.</w:t>
+      </w:r>
+    </w:p>
+    <w:p>
+      <w:pPr>
+        <w:numPr>
+          <w:ilvl w:val="0"/>
+          <w:numId w:val="4"/>
+        </w:numPr>
+        <w:spacing w:before="0" w:after="80" w:line="300" w:lineRule="auto"/>
+      </w:pPr>
+      <w:r>
+        <w:rPr>
+          <w:rFonts w:ascii="Calibri" w:hAnsi="Calibri"/>
+        </w:rPr>
+        <w:t>Documentacion oficial de OpenCV: https://docs.opencv.org/</w:t>
+      </w:r>
+    </w:p>
+    <w:p>
+      <w:pPr>
+        <w:numPr>
+          <w:ilvl w:val="0"/>
+          <w:numId w:val="4"/>
+        </w:numPr>
+        <w:spacing w:before="0" w:after="80" w:line="300" w:lineRule="auto"/>
+      </w:pPr>
+      <w:r>
+        <w:rPr>
+          <w:rFonts w:ascii="Calibri" w:hAnsi="Calibri"/>
+        </w:rPr>
+        <w:t>Documentacion de NumPy: https://numpy.org/doc/</w:t>
+      </w:r>
+    </w:p>
+    <w:p>
+      <w:pPr>
+        <w:numPr>
+          <w:ilvl w:val="0"/>
+          <w:numId w:val="4"/>
+        </w:numPr>
+        <w:spacing w:before="0" w:after="80" w:line="300" w:lineRule="auto"/>
+      </w:pPr>
+      <w:r>
+        <w:rPr>
+          <w:rFonts w:ascii="Calibri" w:hAnsi="Calibri"/>
+        </w:rPr>
+        <w:t>Documentacion de Matplotlib: https://matplotlib.org/stable/</w:t>
       </w:r>
     </w:p>
     <w:sectPr>
       <w:headerReference r:id="rId7" w:type="default"/>
+      <w:footerReference w:type="default" r:id="rId17"/>
       <w:pgSz w:h="16838" w:w="11906" w:orient="portrait"/>
-      <w:pgMar w:bottom="1276" w:top="1440" w:left="1080" w:right="1080" w:header="708" w:footer="708"/>
+      <w:pgMar w:bottom="1440" w:top="1440" w:left="1440" w:right="1440" w:header="708" w:footer="708"/>
       <w:pgNumType w:start="1"/>
     </w:sectPr>
   </w:body>
 </w:document>
+</file>
+
+<file path=word/footer1.xml><?xml version="1.0" encoding="utf-8"?>
+<w:ftr xmlns:m="http://schemas.openxmlformats.org/officeDocument/2006/math" xmlns:mc="http://schemas.openxmlformats.org/markup-compatibility/2006" xmlns:mo="http://schemas.microsoft.com/office/mac/office/2008/main" xmlns:mv="urn:schemas-microsoft-com:mac:vml" xmlns:o="urn:schemas-microsoft-com:office:office" xmlns:r="http://schemas.openxmlformats.org/officeDocument/2006/relationships" xmlns:v="urn:schemas-microsoft-com:vml" xmlns:w10="urn:schemas-microsoft-com:office:word" xmlns:w14="http://schemas.microsoft.com/office/word/2010/wordml" xmlns:w="http://schemas.openxmlformats.org/wordprocessingml/2006/main" xmlns:wne="http://schemas.microsoft.com/office/word/2006/wordml" xmlns:wp14="http://schemas.microsoft.com/office/word/2010/wordprocessingDrawing" xmlns:wp="http://schemas.openxmlformats.org/drawingml/2006/wordprocessingDrawing" xmlns:wpc="http://schemas.microsoft.com/office/word/2010/wordprocessingCanvas" xmlns:wpg="http://schemas.microsoft.com/office/word/2010/wordprocessingGroup" xmlns:wpi="http://schemas.microsoft.com/office/word/2010/wordprocessingInk" xmlns:wps="http://schemas.microsoft.com/office/word/2010/wordprocessingShape" mc:Ignorable="w14 wp14">
+  <w:p>
+    <w:pPr>
+      <w:pStyle w:val="Footer"/>
+      <w:jc w:val="center"/>
+    </w:pPr>
+    <w:r>
+      <w:rPr>
+        <w:rFonts w:ascii="Calibri" w:hAnsi="Calibri"/>
+        <w:color w:val="555555"/>
+        <w:sz w:val="18"/>
+      </w:rPr>
+      <w:t>Laboratorio 08 - Procesamiento de Imagenes</w:t>
+    </w:r>
+  </w:p>
+</w:ftr>
 </file>
 
 <file path=word/header1.xml><?xml version="1.0" encoding="utf-8"?>
@@ -2288,6 +3906,19 @@
   <w:num w:numId="3">
     <w:abstractNumId w:val="3"/>
   </w:num>
+  <w:abstractNum w:abstractNumId="4">
+    <w:lvl w:ilvl="0">
+      <w:numFmt w:val="bullet"/>
+      <w:lvlText w:val="?"/>
+      <w:lvlJc w:val="left"/>
+      <w:pPr>
+        <w:ind w:left="540" w:hanging="270"/>
+      </w:pPr>
+    </w:lvl>
+  </w:abstractNum>
+  <w:num w:numId="4">
+    <w:abstractNumId w:val="4"/>
+  </w:num>
 </w:numbering>
 </file>
 
@@ -2321,6 +3952,13 @@
   </w:style>
   <w:style w:type="paragraph" w:styleId="Normal" w:default="1">
     <w:name w:val="normal"/>
+    <w:pPr>
+      <w:spacing w:after="120" w:line="300" w:lineRule="auto"/>
+    </w:pPr>
+    <w:rPr>
+      <w:rFonts w:ascii="Calibri" w:hAnsi="Calibri"/>
+      <w:sz w:val="22"/>
+    </w:rPr>
   </w:style>
   <w:style w:type="paragraph" w:styleId="Heading1">
     <w:name w:val="heading 1"/>

</xml_diff>